<commit_message>
Some final polishing on References before submission
</commit_message>
<xml_diff>
--- a/docs/L00196623-AnnMarieDunne.docx
+++ b/docs/L00196623-AnnMarieDunne.docx
@@ -530,90 +530,8 @@
           <w:sz w:val="24"/>
           <w:szCs w:val="40"/>
         </w:rPr>
-        <w:t xml:space="preserve">Arna chur </w:t>
-      </w:r>
-      <w:proofErr w:type="spellStart"/>
-      <w:r>
-        <w:rPr>
-          <w:i/>
-          <w:sz w:val="24"/>
-          <w:szCs w:val="40"/>
-        </w:rPr>
-        <w:t>isteach</w:t>
-      </w:r>
-      <w:proofErr w:type="spellEnd"/>
-      <w:r>
-        <w:rPr>
-          <w:i/>
-          <w:sz w:val="24"/>
-          <w:szCs w:val="40"/>
-        </w:rPr>
-        <w:t xml:space="preserve"> </w:t>
-      </w:r>
-      <w:proofErr w:type="spellStart"/>
-      <w:r>
-        <w:rPr>
-          <w:i/>
-          <w:sz w:val="24"/>
-          <w:szCs w:val="40"/>
-        </w:rPr>
-        <w:t>chuig</w:t>
-      </w:r>
-      <w:proofErr w:type="spellEnd"/>
-      <w:r>
-        <w:rPr>
-          <w:i/>
-          <w:sz w:val="24"/>
-          <w:szCs w:val="40"/>
-        </w:rPr>
-        <w:t xml:space="preserve"> </w:t>
-      </w:r>
-      <w:proofErr w:type="spellStart"/>
-      <w:r>
-        <w:rPr>
-          <w:i/>
-          <w:sz w:val="24"/>
-          <w:szCs w:val="40"/>
-        </w:rPr>
-        <w:t>Ollscoil</w:t>
-      </w:r>
-      <w:proofErr w:type="spellEnd"/>
-      <w:r>
-        <w:rPr>
-          <w:i/>
-          <w:sz w:val="24"/>
-          <w:szCs w:val="40"/>
-        </w:rPr>
-        <w:t xml:space="preserve"> </w:t>
-      </w:r>
-      <w:proofErr w:type="spellStart"/>
-      <w:r>
-        <w:rPr>
-          <w:i/>
-          <w:sz w:val="24"/>
-          <w:szCs w:val="40"/>
-        </w:rPr>
-        <w:t>Teicneolaiochta</w:t>
-      </w:r>
-      <w:proofErr w:type="spellEnd"/>
-      <w:r>
-        <w:rPr>
-          <w:i/>
-          <w:sz w:val="24"/>
-          <w:szCs w:val="40"/>
-        </w:rPr>
-        <w:t xml:space="preserve"> an </w:t>
-      </w:r>
-      <w:proofErr w:type="spellStart"/>
-      <w:r>
-        <w:rPr>
-          <w:i/>
-          <w:sz w:val="24"/>
-          <w:szCs w:val="40"/>
-        </w:rPr>
-        <w:t>Atlantaigh</w:t>
-      </w:r>
-      <w:proofErr w:type="spellEnd"/>
+        <w:t>Arna chur isteach chuig Ollscoil Teicneolaiochta an Atlantaigh</w:t>
+      </w:r>
       <w:r>
         <w:rPr>
           <w:sz w:val="24"/>
@@ -655,7 +573,7 @@
         <w:pStyle w:val="Heading1"/>
         <w:ind w:left="1134" w:hanging="1134"/>
       </w:pPr>
-      <w:bookmarkStart w:id="0" w:name="_Toc224392245"/>
+      <w:bookmarkStart w:id="0" w:name="_Toc224585252"/>
       <w:r>
         <w:lastRenderedPageBreak/>
         <w:t>Declaration</w:t>
@@ -1051,7 +969,7 @@
         <w:spacing w:before="0" w:line="360" w:lineRule="auto"/>
         <w:ind w:left="1134" w:hanging="1134"/>
       </w:pPr>
-      <w:bookmarkStart w:id="1" w:name="_Toc224392246"/>
+      <w:bookmarkStart w:id="1" w:name="_Toc224585253"/>
       <w:r>
         <w:t>Acknowledgements</w:t>
       </w:r>
@@ -1059,12 +977,7 @@
     </w:p>
     <w:p>
       <w:pPr>
-        <w:pStyle w:val="PRBodyText"/>
-        <w:spacing w:line="360" w:lineRule="auto"/>
-        <w:rPr>
-          <w:rFonts w:asciiTheme="minorHAnsi" w:hAnsiTheme="minorHAnsi"/>
-          <w:sz w:val="40"/>
-        </w:rPr>
+        <w:pStyle w:val="Heading1"/>
       </w:pPr>
     </w:p>
     <w:p>
@@ -1120,7 +1033,7 @@
         <w:spacing w:before="0" w:line="360" w:lineRule="auto"/>
         <w:ind w:left="1134" w:hanging="1134"/>
       </w:pPr>
-      <w:bookmarkStart w:id="2" w:name="_Toc224392247"/>
+      <w:bookmarkStart w:id="2" w:name="_Toc224585254"/>
       <w:r>
         <w:lastRenderedPageBreak/>
         <w:t>Abstract</w:t>
@@ -1224,7 +1137,7 @@
         <w:ind w:left="567" w:hanging="567"/>
       </w:pPr>
       <w:bookmarkStart w:id="3" w:name="_Ref357437742"/>
-      <w:bookmarkStart w:id="4" w:name="_Toc224392248"/>
+      <w:bookmarkStart w:id="4" w:name="_Toc224585255"/>
       <w:r>
         <w:lastRenderedPageBreak/>
         <w:t>Ac</w:t>
@@ -1980,7 +1893,7 @@
       <w:pPr>
         <w:pStyle w:val="Heading1"/>
       </w:pPr>
-      <w:bookmarkStart w:id="5" w:name="_Toc224392249"/>
+      <w:bookmarkStart w:id="5" w:name="_Toc224585256"/>
       <w:r>
         <w:lastRenderedPageBreak/>
         <w:t>Table of Contents</w:t>
@@ -2028,7 +1941,7 @@
           <w:r>
             <w:fldChar w:fldCharType="separate"/>
           </w:r>
-          <w:hyperlink w:anchor="_Toc224392245" w:history="1">
+          <w:hyperlink w:anchor="_Toc224585252" w:history="1">
             <w:r>
               <w:rPr>
                 <w:rStyle w:val="Hyperlink"/>
@@ -2055,7 +1968,7 @@
                 <w:noProof/>
                 <w:webHidden/>
               </w:rPr>
-              <w:instrText xml:space="preserve"> PAGEREF _Toc224392245 \h </w:instrText>
+              <w:instrText xml:space="preserve"> PAGEREF _Toc224585252 \h </w:instrText>
             </w:r>
             <w:r>
               <w:rPr>
@@ -2101,7 +2014,7 @@
               <w14:ligatures w14:val="standardContextual"/>
             </w:rPr>
           </w:pPr>
-          <w:hyperlink w:anchor="_Toc224392246" w:history="1">
+          <w:hyperlink w:anchor="_Toc224585253" w:history="1">
             <w:r>
               <w:rPr>
                 <w:rStyle w:val="Hyperlink"/>
@@ -2128,7 +2041,7 @@
                 <w:noProof/>
                 <w:webHidden/>
               </w:rPr>
-              <w:instrText xml:space="preserve"> PAGEREF _Toc224392246 \h </w:instrText>
+              <w:instrText xml:space="preserve"> PAGEREF _Toc224585253 \h </w:instrText>
             </w:r>
             <w:r>
               <w:rPr>
@@ -2174,7 +2087,7 @@
               <w14:ligatures w14:val="standardContextual"/>
             </w:rPr>
           </w:pPr>
-          <w:hyperlink w:anchor="_Toc224392247" w:history="1">
+          <w:hyperlink w:anchor="_Toc224585254" w:history="1">
             <w:r>
               <w:rPr>
                 <w:rStyle w:val="Hyperlink"/>
@@ -2201,7 +2114,7 @@
                 <w:noProof/>
                 <w:webHidden/>
               </w:rPr>
-              <w:instrText xml:space="preserve"> PAGEREF _Toc224392247 \h </w:instrText>
+              <w:instrText xml:space="preserve"> PAGEREF _Toc224585254 \h </w:instrText>
             </w:r>
             <w:r>
               <w:rPr>
@@ -2247,7 +2160,7 @@
               <w14:ligatures w14:val="standardContextual"/>
             </w:rPr>
           </w:pPr>
-          <w:hyperlink w:anchor="_Toc224392248" w:history="1">
+          <w:hyperlink w:anchor="_Toc224585255" w:history="1">
             <w:r>
               <w:rPr>
                 <w:rStyle w:val="Hyperlink"/>
@@ -2274,7 +2187,7 @@
                 <w:noProof/>
                 <w:webHidden/>
               </w:rPr>
-              <w:instrText xml:space="preserve"> PAGEREF _Toc224392248 \h </w:instrText>
+              <w:instrText xml:space="preserve"> PAGEREF _Toc224585255 \h </w:instrText>
             </w:r>
             <w:r>
               <w:rPr>
@@ -2320,7 +2233,7 @@
               <w14:ligatures w14:val="standardContextual"/>
             </w:rPr>
           </w:pPr>
-          <w:hyperlink w:anchor="_Toc224392249" w:history="1">
+          <w:hyperlink w:anchor="_Toc224585256" w:history="1">
             <w:r>
               <w:rPr>
                 <w:rStyle w:val="Hyperlink"/>
@@ -2347,7 +2260,7 @@
                 <w:noProof/>
                 <w:webHidden/>
               </w:rPr>
-              <w:instrText xml:space="preserve"> PAGEREF _Toc224392249 \h </w:instrText>
+              <w:instrText xml:space="preserve"> PAGEREF _Toc224585256 \h </w:instrText>
             </w:r>
             <w:r>
               <w:rPr>
@@ -2393,7 +2306,7 @@
               <w14:ligatures w14:val="standardContextual"/>
             </w:rPr>
           </w:pPr>
-          <w:hyperlink w:anchor="_Toc224392250" w:history="1">
+          <w:hyperlink w:anchor="_Toc224585257" w:history="1">
             <w:r>
               <w:rPr>
                 <w:rStyle w:val="Hyperlink"/>
@@ -2420,7 +2333,7 @@
                 <w:noProof/>
                 <w:webHidden/>
               </w:rPr>
-              <w:instrText xml:space="preserve"> PAGEREF _Toc224392250 \h </w:instrText>
+              <w:instrText xml:space="preserve"> PAGEREF _Toc224585257 \h </w:instrText>
             </w:r>
             <w:r>
               <w:rPr>
@@ -2466,7 +2379,7 @@
               <w14:ligatures w14:val="standardContextual"/>
             </w:rPr>
           </w:pPr>
-          <w:hyperlink w:anchor="_Toc224392251" w:history="1">
+          <w:hyperlink w:anchor="_Toc224585258" w:history="1">
             <w:r>
               <w:rPr>
                 <w:rStyle w:val="Hyperlink"/>
@@ -2493,7 +2406,7 @@
                 <w:noProof/>
                 <w:webHidden/>
               </w:rPr>
-              <w:instrText xml:space="preserve"> PAGEREF _Toc224392251 \h </w:instrText>
+              <w:instrText xml:space="preserve"> PAGEREF _Toc224585258 \h </w:instrText>
             </w:r>
             <w:r>
               <w:rPr>
@@ -2539,7 +2452,7 @@
               <w14:ligatures w14:val="standardContextual"/>
             </w:rPr>
           </w:pPr>
-          <w:hyperlink w:anchor="_Toc224392252" w:history="1">
+          <w:hyperlink w:anchor="_Toc224585259" w:history="1">
             <w:r>
               <w:rPr>
                 <w:rStyle w:val="Hyperlink"/>
@@ -2566,7 +2479,7 @@
                 <w:noProof/>
                 <w:webHidden/>
               </w:rPr>
-              <w:instrText xml:space="preserve"> PAGEREF _Toc224392252 \h </w:instrText>
+              <w:instrText xml:space="preserve"> PAGEREF _Toc224585259 \h </w:instrText>
             </w:r>
             <w:r>
               <w:rPr>
@@ -2613,7 +2526,7 @@
               <w14:ligatures w14:val="standardContextual"/>
             </w:rPr>
           </w:pPr>
-          <w:hyperlink w:anchor="_Toc224392253" w:history="1">
+          <w:hyperlink w:anchor="_Toc224585260" w:history="1">
             <w:r>
               <w:rPr>
                 <w:rStyle w:val="Hyperlink"/>
@@ -2658,7 +2571,7 @@
                 <w:noProof/>
                 <w:webHidden/>
               </w:rPr>
-              <w:instrText xml:space="preserve"> PAGEREF _Toc224392253 \h </w:instrText>
+              <w:instrText xml:space="preserve"> PAGEREF _Toc224585260 \h </w:instrText>
             </w:r>
             <w:r>
               <w:rPr>
@@ -2705,7 +2618,7 @@
               <w14:ligatures w14:val="standardContextual"/>
             </w:rPr>
           </w:pPr>
-          <w:hyperlink w:anchor="_Toc224392254" w:history="1">
+          <w:hyperlink w:anchor="_Toc224585261" w:history="1">
             <w:r>
               <w:rPr>
                 <w:rStyle w:val="Hyperlink"/>
@@ -2750,7 +2663,7 @@
                 <w:noProof/>
                 <w:webHidden/>
               </w:rPr>
-              <w:instrText xml:space="preserve"> PAGEREF _Toc224392254 \h </w:instrText>
+              <w:instrText xml:space="preserve"> PAGEREF _Toc224585261 \h </w:instrText>
             </w:r>
             <w:r>
               <w:rPr>
@@ -2797,7 +2710,7 @@
               <w14:ligatures w14:val="standardContextual"/>
             </w:rPr>
           </w:pPr>
-          <w:hyperlink w:anchor="_Toc224392255" w:history="1">
+          <w:hyperlink w:anchor="_Toc224585262" w:history="1">
             <w:r>
               <w:rPr>
                 <w:rStyle w:val="Hyperlink"/>
@@ -2842,7 +2755,7 @@
                 <w:noProof/>
                 <w:webHidden/>
               </w:rPr>
-              <w:instrText xml:space="preserve"> PAGEREF _Toc224392255 \h </w:instrText>
+              <w:instrText xml:space="preserve"> PAGEREF _Toc224585262 \h </w:instrText>
             </w:r>
             <w:r>
               <w:rPr>
@@ -2889,7 +2802,7 @@
               <w14:ligatures w14:val="standardContextual"/>
             </w:rPr>
           </w:pPr>
-          <w:hyperlink w:anchor="_Toc224392256" w:history="1">
+          <w:hyperlink w:anchor="_Toc224585263" w:history="1">
             <w:r>
               <w:rPr>
                 <w:rStyle w:val="Hyperlink"/>
@@ -2934,7 +2847,7 @@
                 <w:noProof/>
                 <w:webHidden/>
               </w:rPr>
-              <w:instrText xml:space="preserve"> PAGEREF _Toc224392256 \h </w:instrText>
+              <w:instrText xml:space="preserve"> PAGEREF _Toc224585263 \h </w:instrText>
             </w:r>
             <w:r>
               <w:rPr>
@@ -2954,7 +2867,7 @@
                 <w:noProof/>
                 <w:webHidden/>
               </w:rPr>
-              <w:t>3</w:t>
+              <w:t>4</w:t>
             </w:r>
             <w:r>
               <w:rPr>
@@ -2981,7 +2894,7 @@
               <w14:ligatures w14:val="standardContextual"/>
             </w:rPr>
           </w:pPr>
-          <w:hyperlink w:anchor="_Toc224392257" w:history="1">
+          <w:hyperlink w:anchor="_Toc224585264" w:history="1">
             <w:r>
               <w:rPr>
                 <w:rStyle w:val="Hyperlink"/>
@@ -3026,7 +2939,7 @@
                 <w:noProof/>
                 <w:webHidden/>
               </w:rPr>
-              <w:instrText xml:space="preserve"> PAGEREF _Toc224392257 \h </w:instrText>
+              <w:instrText xml:space="preserve"> PAGEREF _Toc224585264 \h </w:instrText>
             </w:r>
             <w:r>
               <w:rPr>
@@ -3073,7 +2986,7 @@
               <w14:ligatures w14:val="standardContextual"/>
             </w:rPr>
           </w:pPr>
-          <w:hyperlink w:anchor="_Toc224392258" w:history="1">
+          <w:hyperlink w:anchor="_Toc224585265" w:history="1">
             <w:r>
               <w:rPr>
                 <w:rStyle w:val="Hyperlink"/>
@@ -3118,7 +3031,7 @@
                 <w:noProof/>
                 <w:webHidden/>
               </w:rPr>
-              <w:instrText xml:space="preserve"> PAGEREF _Toc224392258 \h </w:instrText>
+              <w:instrText xml:space="preserve"> PAGEREF _Toc224585265 \h </w:instrText>
             </w:r>
             <w:r>
               <w:rPr>
@@ -3165,7 +3078,7 @@
               <w14:ligatures w14:val="standardContextual"/>
             </w:rPr>
           </w:pPr>
-          <w:hyperlink w:anchor="_Toc224392259" w:history="1">
+          <w:hyperlink w:anchor="_Toc224585266" w:history="1">
             <w:r>
               <w:rPr>
                 <w:rStyle w:val="Hyperlink"/>
@@ -3210,7 +3123,7 @@
                 <w:noProof/>
                 <w:webHidden/>
               </w:rPr>
-              <w:instrText xml:space="preserve"> PAGEREF _Toc224392259 \h </w:instrText>
+              <w:instrText xml:space="preserve"> PAGEREF _Toc224585266 \h </w:instrText>
             </w:r>
             <w:r>
               <w:rPr>
@@ -3230,7 +3143,7 @@
                 <w:noProof/>
                 <w:webHidden/>
               </w:rPr>
-              <w:t>4</w:t>
+              <w:t>5</w:t>
             </w:r>
             <w:r>
               <w:rPr>
@@ -3257,7 +3170,7 @@
               <w14:ligatures w14:val="standardContextual"/>
             </w:rPr>
           </w:pPr>
-          <w:hyperlink w:anchor="_Toc224392260" w:history="1">
+          <w:hyperlink w:anchor="_Toc224585267" w:history="1">
             <w:r>
               <w:rPr>
                 <w:rStyle w:val="Hyperlink"/>
@@ -3302,7 +3215,7 @@
                 <w:noProof/>
                 <w:webHidden/>
               </w:rPr>
-              <w:instrText xml:space="preserve"> PAGEREF _Toc224392260 \h </w:instrText>
+              <w:instrText xml:space="preserve"> PAGEREF _Toc224585267 \h </w:instrText>
             </w:r>
             <w:r>
               <w:rPr>
@@ -3349,7 +3262,7 @@
               <w14:ligatures w14:val="standardContextual"/>
             </w:rPr>
           </w:pPr>
-          <w:hyperlink w:anchor="_Toc224392261" w:history="1">
+          <w:hyperlink w:anchor="_Toc224585268" w:history="1">
             <w:r>
               <w:rPr>
                 <w:rStyle w:val="Hyperlink"/>
@@ -3394,7 +3307,7 @@
                 <w:noProof/>
                 <w:webHidden/>
               </w:rPr>
-              <w:instrText xml:space="preserve"> PAGEREF _Toc224392261 \h </w:instrText>
+              <w:instrText xml:space="preserve"> PAGEREF _Toc224585268 \h </w:instrText>
             </w:r>
             <w:r>
               <w:rPr>
@@ -3441,7 +3354,7 @@
               <w14:ligatures w14:val="standardContextual"/>
             </w:rPr>
           </w:pPr>
-          <w:hyperlink w:anchor="_Toc224392262" w:history="1">
+          <w:hyperlink w:anchor="_Toc224585269" w:history="1">
             <w:r>
               <w:rPr>
                 <w:rStyle w:val="Hyperlink"/>
@@ -3486,7 +3399,7 @@
                 <w:noProof/>
                 <w:webHidden/>
               </w:rPr>
-              <w:instrText xml:space="preserve"> PAGEREF _Toc224392262 \h </w:instrText>
+              <w:instrText xml:space="preserve"> PAGEREF _Toc224585269 \h </w:instrText>
             </w:r>
             <w:r>
               <w:rPr>
@@ -3533,7 +3446,7 @@
               <w14:ligatures w14:val="standardContextual"/>
             </w:rPr>
           </w:pPr>
-          <w:hyperlink w:anchor="_Toc224392263" w:history="1">
+          <w:hyperlink w:anchor="_Toc224585270" w:history="1">
             <w:r>
               <w:rPr>
                 <w:rStyle w:val="Hyperlink"/>
@@ -3578,7 +3491,7 @@
                 <w:noProof/>
                 <w:webHidden/>
               </w:rPr>
-              <w:instrText xml:space="preserve"> PAGEREF _Toc224392263 \h </w:instrText>
+              <w:instrText xml:space="preserve"> PAGEREF _Toc224585270 \h </w:instrText>
             </w:r>
             <w:r>
               <w:rPr>
@@ -3625,7 +3538,7 @@
               <w14:ligatures w14:val="standardContextual"/>
             </w:rPr>
           </w:pPr>
-          <w:hyperlink w:anchor="_Toc224392264" w:history="1">
+          <w:hyperlink w:anchor="_Toc224585271" w:history="1">
             <w:r>
               <w:rPr>
                 <w:rStyle w:val="Hyperlink"/>
@@ -3670,7 +3583,7 @@
                 <w:noProof/>
                 <w:webHidden/>
               </w:rPr>
-              <w:instrText xml:space="preserve"> PAGEREF _Toc224392264 \h </w:instrText>
+              <w:instrText xml:space="preserve"> PAGEREF _Toc224585271 \h </w:instrText>
             </w:r>
             <w:r>
               <w:rPr>
@@ -3717,7 +3630,7 @@
               <w14:ligatures w14:val="standardContextual"/>
             </w:rPr>
           </w:pPr>
-          <w:hyperlink w:anchor="_Toc224392265" w:history="1">
+          <w:hyperlink w:anchor="_Toc224585272" w:history="1">
             <w:r>
               <w:rPr>
                 <w:rStyle w:val="Hyperlink"/>
@@ -3762,7 +3675,7 @@
                 <w:noProof/>
                 <w:webHidden/>
               </w:rPr>
-              <w:instrText xml:space="preserve"> PAGEREF _Toc224392265 \h </w:instrText>
+              <w:instrText xml:space="preserve"> PAGEREF _Toc224585272 \h </w:instrText>
             </w:r>
             <w:r>
               <w:rPr>
@@ -3809,7 +3722,7 @@
               <w14:ligatures w14:val="standardContextual"/>
             </w:rPr>
           </w:pPr>
-          <w:hyperlink w:anchor="_Toc224392266" w:history="1">
+          <w:hyperlink w:anchor="_Toc224585273" w:history="1">
             <w:r>
               <w:rPr>
                 <w:rStyle w:val="Hyperlink"/>
@@ -3854,7 +3767,7 @@
                 <w:noProof/>
                 <w:webHidden/>
               </w:rPr>
-              <w:instrText xml:space="preserve"> PAGEREF _Toc224392266 \h </w:instrText>
+              <w:instrText xml:space="preserve"> PAGEREF _Toc224585273 \h </w:instrText>
             </w:r>
             <w:r>
               <w:rPr>
@@ -3900,7 +3813,7 @@
               <w14:ligatures w14:val="standardContextual"/>
             </w:rPr>
           </w:pPr>
-          <w:hyperlink w:anchor="_Toc224392267" w:history="1">
+          <w:hyperlink w:anchor="_Toc224585274" w:history="1">
             <w:r>
               <w:rPr>
                 <w:rStyle w:val="Hyperlink"/>
@@ -3927,7 +3840,7 @@
                 <w:noProof/>
                 <w:webHidden/>
               </w:rPr>
-              <w:instrText xml:space="preserve"> PAGEREF _Toc224392267 \h </w:instrText>
+              <w:instrText xml:space="preserve"> PAGEREF _Toc224585274 \h </w:instrText>
             </w:r>
             <w:r>
               <w:rPr>
@@ -3973,7 +3886,7 @@
               <w14:ligatures w14:val="standardContextual"/>
             </w:rPr>
           </w:pPr>
-          <w:hyperlink w:anchor="_Toc224392268" w:history="1">
+          <w:hyperlink w:anchor="_Toc224585275" w:history="1">
             <w:r>
               <w:rPr>
                 <w:rStyle w:val="Hyperlink"/>
@@ -4000,7 +3913,7 @@
                 <w:noProof/>
                 <w:webHidden/>
               </w:rPr>
-              <w:instrText xml:space="preserve"> PAGEREF _Toc224392268 \h </w:instrText>
+              <w:instrText xml:space="preserve"> PAGEREF _Toc224585275 \h </w:instrText>
             </w:r>
             <w:r>
               <w:rPr>
@@ -4046,7 +3959,7 @@
               <w14:ligatures w14:val="standardContextual"/>
             </w:rPr>
           </w:pPr>
-          <w:hyperlink w:anchor="_Toc224392269" w:history="1">
+          <w:hyperlink w:anchor="_Toc224585276" w:history="1">
             <w:r>
               <w:rPr>
                 <w:rStyle w:val="Hyperlink"/>
@@ -4073,7 +3986,7 @@
                 <w:noProof/>
                 <w:webHidden/>
               </w:rPr>
-              <w:instrText xml:space="preserve"> PAGEREF _Toc224392269 \h </w:instrText>
+              <w:instrText xml:space="preserve"> PAGEREF _Toc224585276 \h </w:instrText>
             </w:r>
             <w:r>
               <w:rPr>
@@ -4136,7 +4049,7 @@
       <w:pPr>
         <w:pStyle w:val="Heading1"/>
       </w:pPr>
-      <w:bookmarkStart w:id="6" w:name="_Toc224392250"/>
+      <w:bookmarkStart w:id="6" w:name="_Toc224585257"/>
       <w:r>
         <w:lastRenderedPageBreak/>
         <w:t>Table of Figures</w:t>
@@ -4382,7 +4295,7 @@
       <w:pPr>
         <w:pStyle w:val="Heading1"/>
       </w:pPr>
-      <w:bookmarkStart w:id="7" w:name="_Toc224392251"/>
+      <w:bookmarkStart w:id="7" w:name="_Toc224585258"/>
       <w:r>
         <w:lastRenderedPageBreak/>
         <w:t>Table of Tables</w:t>
@@ -4568,7 +4481,7 @@
       <w:pPr>
         <w:pStyle w:val="Heading1"/>
       </w:pPr>
-      <w:bookmarkStart w:id="8" w:name="_Toc224392252"/>
+      <w:bookmarkStart w:id="8" w:name="_Toc224585259"/>
       <w:r>
         <w:lastRenderedPageBreak/>
         <w:t>Table of Code Listings</w:t>
@@ -4683,15 +4596,15 @@
       </w:pPr>
       <w:bookmarkStart w:id="9" w:name="_Ref357510072"/>
       <w:bookmarkStart w:id="10" w:name="_Toc76997399"/>
-      <w:bookmarkStart w:id="11" w:name="_Toc224392253"/>
-      <w:bookmarkStart w:id="12" w:name="_Toc76997400"/>
+      <w:bookmarkStart w:id="11" w:name="_Toc76997400"/>
+      <w:bookmarkStart w:id="12" w:name="_Toc224585260"/>
       <w:r>
         <w:lastRenderedPageBreak/>
         <w:t>Introduction</w:t>
       </w:r>
       <w:bookmarkEnd w:id="9"/>
       <w:bookmarkEnd w:id="10"/>
-      <w:bookmarkEnd w:id="11"/>
+      <w:bookmarkEnd w:id="12"/>
     </w:p>
     <w:p>
       <w:pPr>
@@ -4728,7 +4641,7 @@
           <w:sz w:val="24"/>
           <w:szCs w:val="24"/>
         </w:rPr>
-        <w:instrText xml:space="preserve"> ADDIN ZOTERO_ITEM CSL_CITATION {"citationID":"qtaRIXHs","properties":{"unsorted":false,"formattedCitation":"(Central Statistics Office, 2024)","plainCitation":"(Central Statistics Office, 2024)","noteIndex":0},"citationItems":[{"id":3,"uris":["http://zotero.org/users/19861326/items/Y3CG4YS9"],"itemData":{"id":3,"type":"webpage","language":"en","publisher":"CSO","title":"Key Findings Census of Population 2022 Spotlight Series: Volunteering in Ireland - Central Statistics Office","title-short":"Key Findings Census of Population 2022 Spotlight Series","URL":"https://www.cso.ie/en/releasesandpublications/ep/p-cpsv/censusofpopulation2022spotlightseriesvolunteeringinireland/keyfindings/","author":[{"literal":"Central Statistics Office"}],"accessed":{"date-parts":[["2026",3,6]]},"issued":{"date-parts":[["2024",2,1]]}}}],"schema":"https://github.com/citation-style-language/schema/raw/master/csl-citation.json"} </w:instrText>
+        <w:instrText xml:space="preserve"> ADDIN ZOTERO_ITEM CSL_CITATION {"citationID":"qtaRIXHs","properties":{"unsorted":false,"formattedCitation":"(Central Statistics Office, 2024)","plainCitation":"(Central Statistics Office, 2024)","noteIndex":0},"citationItems":[{"id":3,"uris":["http://zotero.org/users/19861326/items/Y3CG4YS9"],"itemData":{"id":3,"type":"webpage","language":"en","publisher":"CSO","title":"Key Findings Census of Population 2022 Spotlight Series: Volunteering in Ireland","title-short":"Census of Population 2022 Spotlight Series: Volunteering in Ireland","URL":"https://www.cso.ie/en/releasesandpublications/ep/p-cpsv/censusofpopulation2022spotlightseriesvolunteeringinireland/keyfindings/","author":[{"literal":"Central Statistics Office"}],"accessed":{"date-parts":[["2026",3,6]]},"issued":{"date-parts":[["2024",2,1]]}}}],"schema":"https://github.com/citation-style-language/schema/raw/master/csl-citation.json"} </w:instrText>
       </w:r>
       <w:r>
         <w:rPr>
@@ -4784,7 +4697,7 @@
           <w:sz w:val="24"/>
           <w:szCs w:val="24"/>
         </w:rPr>
-        <w:instrText xml:space="preserve"> ADDIN ZOTERO_ITEM CSL_CITATION {"citationID":"KGNWTYzy","properties":{"unsorted":false,"formattedCitation":"(Department of Rural and Community Development, 2021)","plainCitation":"(Department of Rural and Community Development, 2021)","noteIndex":0},"citationItems":[{"id":20,"uris":["http://zotero.org/users/19861326/items/LMU3XH4F"],"itemData":{"id":20,"type":"webpage","abstract":"Setting out a long-term vision for volunteering and volunteers in Ireland.","container-title":"gov.ie","language":"en","title":"National Volunteering Strategy (2021 - 2025)","URL":"https://www.gov.ie/en/department-of-rural-and-community-development-and-the-gaeltacht/publications/national-volunteering-strategy-2021-2025/","author":[{"literal":"Department of Rural and Community Development"}],"accessed":{"date-parts":[["2026",3,9]]},"issued":{"date-parts":[["2021"]]}}}],"schema":"https://github.com/citation-style-language/schema/raw/master/csl-citation.json"} </w:instrText>
+        <w:instrText xml:space="preserve"> ADDIN ZOTERO_ITEM CSL_CITATION {"citationID":"KGNWTYzy","properties":{"unsorted":false,"formattedCitation":"(Department of Rural and Community Development, 2021)","plainCitation":"(Department of Rural and Community Development, 2021)","noteIndex":0},"citationItems":[{"id":20,"uris":["http://zotero.org/users/19861326/items/LMU3XH4F"],"itemData":{"id":20,"type":"webpage","abstract":"Setting out a long-term vision for volunteering and volunteers in Ireland.","container-title":"gov.ie","language":"en","title":"National Volunteering Strategy (2021 - 2025)","title-short":"National Volunteering Strategy","URL":"https://www.gov.ie/en/department-of-rural-and-community-development-and-the-gaeltacht/publications/national-volunteering-strategy-2021-2025/","author":[{"literal":"Department of Rural and Community Development"}],"accessed":{"date-parts":[["2026",3,9]]},"issued":{"date-parts":[["2021"]]}}}],"schema":"https://github.com/citation-style-language/schema/raw/master/csl-citation.json"} </w:instrText>
       </w:r>
       <w:r>
         <w:rPr>
@@ -4883,14 +4796,14 @@
           <w:szCs w:val="28"/>
         </w:rPr>
       </w:pPr>
-      <w:bookmarkStart w:id="13" w:name="_Toc224392254"/>
+      <w:bookmarkStart w:id="13" w:name="_Toc224585261"/>
       <w:r>
         <w:rPr>
           <w:szCs w:val="28"/>
         </w:rPr>
         <w:t>Purpose</w:t>
       </w:r>
-      <w:bookmarkEnd w:id="12"/>
+      <w:bookmarkEnd w:id="11"/>
       <w:bookmarkEnd w:id="13"/>
     </w:p>
     <w:p>
@@ -4999,7 +4912,21 @@
           <w:szCs w:val="24"/>
         </w:rPr>
         <w:lastRenderedPageBreak/>
-        <w:t>with the General Data Protection Regulation (GDPR), the principles of which will be explored further in Section 1.2.</w:t>
+        <w:t xml:space="preserve">with the General Data Protection Regulation (GDPR), the principles of which will be explored further in </w:t>
+      </w:r>
+      <w:r>
+        <w:rPr>
+          <w:sz w:val="24"/>
+          <w:szCs w:val="24"/>
+        </w:rPr>
+        <w:t>the Design Chapter</w:t>
+      </w:r>
+      <w:r>
+        <w:rPr>
+          <w:sz w:val="24"/>
+          <w:szCs w:val="24"/>
+        </w:rPr>
+        <w:t>.</w:t>
       </w:r>
     </w:p>
     <w:p>
@@ -5023,7 +4950,7 @@
         </w:numPr>
         <w:ind w:left="851" w:hanging="851"/>
       </w:pPr>
-      <w:bookmarkStart w:id="14" w:name="_Toc224392255"/>
+      <w:bookmarkStart w:id="14" w:name="_Toc224585262"/>
       <w:r>
         <w:t>Background</w:t>
       </w:r>
@@ -5043,7 +4970,56 @@
           <w:sz w:val="24"/>
           <w:szCs w:val="24"/>
         </w:rPr>
-        <w:t xml:space="preserve">The legislative basis for Garda Vetting in Ireland is established by the National Vetting Bureau (Children and Vulnerable Persons) Acts 2012–2016, which make it a statutory requirement for any person carrying out relevant work or activities involving access to children or vulnerable adults to be vetted prior to commencing such work. Under the Acts, a relevant organisation is prohibited from permitting any person to undertake relevant work unless a vetting disclosure has been received from the National Vetting Bureau (NVB) in respect of that individual. </w:t>
+        <w:t>The legislative basis for Garda Vetting in Ireland is established by the National Vetting Bureau (Children and Vulnerable Persons) Acts 2012–2016, which make it a statutory requirement for any person carrying out relevant work or activities involving access to children or vulnerable adults to be vetted prior to commencing such work</w:t>
+      </w:r>
+      <w:r>
+        <w:rPr>
+          <w:sz w:val="24"/>
+          <w:szCs w:val="24"/>
+        </w:rPr>
+        <w:t xml:space="preserve"> </w:t>
+      </w:r>
+      <w:r>
+        <w:rPr>
+          <w:sz w:val="24"/>
+          <w:szCs w:val="24"/>
+        </w:rPr>
+        <w:fldChar w:fldCharType="begin"/>
+      </w:r>
+      <w:r>
+        <w:rPr>
+          <w:sz w:val="24"/>
+          <w:szCs w:val="24"/>
+        </w:rPr>
+        <w:instrText xml:space="preserve"> ADDIN ZOTERO_ITEM CSL_CITATION {"citationID":"eSfgEDh4","properties":{"unsorted":false,"formattedCitation":"(Government of Ireland, 2012; An Garda S\\uc0\\u237{}och\\uc0\\u225{}na, 2016)","plainCitation":"(Government of Ireland, 2012; An Garda Síochána, 2016)","noteIndex":0},"citationItems":[{"id":5,"uris":["http://zotero.org/users/19861326/items/69TGCESM"],"itemData":{"id":5,"type":"webpage","container-title":"National Vetting Bureau (Children and Vulnerable Persons) Act 2012","genre":"Irish Statute Book","language":"en","publisher":"Office of the Attorney General","title":"Electronic Irish Statute Book (eISB)","title-short":"National Vetting Bureau (Children and Vulnerable Persons) Act 2012","URL":"https://www.irishstatutebook.ie/eli/2012/act/47/enacted/en/html","author":[{"literal":"Government of Ireland"}],"accessed":{"date-parts":[["2026",3,6]]},"issued":{"date-parts":[["2012"]]}}},{"id":12,"uris":["http://zotero.org/users/19861326/items/TZCDPKMT"],"itemData":{"id":12,"type":"webpage","container-title":"An Garda Síochána","language":"en","title":"Garda National Vetting Bureau (GNVB)","URL":"https://www.garda.ie/en/about-us/organised-serious-crime/garda-national-vetting-bureau-gnvb-/","author":[{"literal":"An Garda Síochána"}],"accessed":{"date-parts":[["2026",3,7]]},"issued":{"date-parts":[["2016"]]}}}],"schema":"https://github.com/citation-style-language/schema/raw/master/csl-citation.json"} </w:instrText>
+      </w:r>
+      <w:r>
+        <w:rPr>
+          <w:sz w:val="24"/>
+          <w:szCs w:val="24"/>
+        </w:rPr>
+        <w:fldChar w:fldCharType="separate"/>
+      </w:r>
+      <w:r>
+        <w:rPr>
+          <w:rFonts w:ascii="Calibri" w:hAnsi="Calibri" w:cs="Calibri"/>
+          <w:sz w:val="24"/>
+        </w:rPr>
+        <w:t>(Government of Ireland, 2012; An Garda Síochána, 2016)</w:t>
+      </w:r>
+      <w:r>
+        <w:rPr>
+          <w:sz w:val="24"/>
+          <w:szCs w:val="24"/>
+        </w:rPr>
+        <w:fldChar w:fldCharType="end"/>
+      </w:r>
+      <w:r>
+        <w:rPr>
+          <w:sz w:val="24"/>
+          <w:szCs w:val="24"/>
+        </w:rPr>
+        <w:t xml:space="preserve">. Under the Acts, a relevant organisation is prohibited from permitting any person to undertake relevant work unless a vetting disclosure has been received from the National Vetting Bureau (NVB) in respect of that individual. </w:t>
       </w:r>
       <w:r>
         <w:rPr>
@@ -5071,7 +5047,7 @@
           <w:sz w:val="24"/>
           <w:szCs w:val="24"/>
         </w:rPr>
-        <w:instrText xml:space="preserve"> ADDIN ZOTERO_ITEM CSL_CITATION {"citationID":"wmJPsrmx","properties":{"unsorted":false,"formattedCitation":"(An Garda S\\uc0\\u237{}och\\uc0\\u225{}na, 2016)","plainCitation":"(An Garda Síochána, 2016)","noteIndex":0},"citationItems":[{"id":12,"uris":["http://zotero.org/users/19861326/items/TZCDPKMT"],"itemData":{"id":12,"type":"webpage","container-title":"Garda","language":"en","title":"Garda National Vetting Bureau","URL":"https://www.garda.ie/en/about-us/organised-serious-crime/garda-national-vetting-bureau-gnvb-/","author":[{"literal":"An Garda Síochána"}],"accessed":{"date-parts":[["2026",3,7]]},"issued":{"date-parts":[["2016"]]}}}],"schema":"https://github.com/citation-style-language/schema/raw/master/csl-citation.json"} </w:instrText>
+        <w:instrText xml:space="preserve"> ADDIN ZOTERO_ITEM CSL_CITATION {"citationID":"wmJPsrmx","properties":{"unsorted":false,"formattedCitation":"(An Garda S\\uc0\\u237{}och\\uc0\\u225{}na, 2016)","plainCitation":"(An Garda Síochána, 2016)","noteIndex":0},"citationItems":[{"id":12,"uris":["http://zotero.org/users/19861326/items/TZCDPKMT"],"itemData":{"id":12,"type":"webpage","container-title":"An Garda Síochána","language":"en","title":"Garda National Vetting Bureau (GNVB)","URL":"https://www.garda.ie/en/about-us/organised-serious-crime/garda-national-vetting-bureau-gnvb-/","author":[{"literal":"An Garda Síochána"}],"accessed":{"date-parts":[["2026",3,7]]},"issued":{"date-parts":[["2016"]]}}}],"schema":"https://github.com/citation-style-language/schema/raw/master/csl-citation.json"} </w:instrText>
       </w:r>
       <w:r>
         <w:rPr>
@@ -5126,23 +5102,7 @@
           <w:sz w:val="24"/>
           <w:szCs w:val="24"/>
         </w:rPr>
-        <w:t xml:space="preserve">The NVB introduced the </w:t>
-      </w:r>
-      <w:proofErr w:type="spellStart"/>
-      <w:r>
-        <w:rPr>
-          <w:sz w:val="24"/>
-          <w:szCs w:val="24"/>
-        </w:rPr>
-        <w:t>eVetting</w:t>
-      </w:r>
-      <w:proofErr w:type="spellEnd"/>
-      <w:r>
-        <w:rPr>
-          <w:sz w:val="24"/>
-          <w:szCs w:val="24"/>
-        </w:rPr>
-        <w:t xml:space="preserve"> system to streamline the application process, removing delays previously associated with paper-based submissions and improving turnaround times</w:t>
+        <w:t>The NVB introduced the eVetting system to streamline the application process, removing delays previously associated with paper-based submissions and improving turnaround times</w:t>
       </w:r>
       <w:r>
         <w:rPr>
@@ -5163,7 +5123,7 @@
           <w:sz w:val="24"/>
           <w:szCs w:val="24"/>
         </w:rPr>
-        <w:instrText xml:space="preserve"> ADDIN ZOTERO_ITEM CSL_CITATION {"citationID":"lnNR7zGA","properties":{"unsorted":false,"formattedCitation":"(National Vetting Bureau, no date)","plainCitation":"(National Vetting Bureau, no date)","noteIndex":0},"citationItems":[{"id":14,"uris":["http://zotero.org/users/19861326/items/N3YG9DFB"],"itemData":{"id":14,"type":"webpage","title":"National Vetting Bureau","URL":"https://vetting.garda.ie/Application/About","author":[{"literal":"National Vetting Bureau"}],"accessed":{"date-parts":[["2026",3,7]]}}}],"schema":"https://github.com/citation-style-language/schema/raw/master/csl-citation.json"} </w:instrText>
+        <w:instrText xml:space="preserve"> ADDIN ZOTERO_ITEM CSL_CITATION {"citationID":"lnNR7zGA","properties":{"unsorted":false,"formattedCitation":"(National Vetting Bureau, no date)","plainCitation":"(National Vetting Bureau, no date)","noteIndex":0},"citationItems":[{"id":14,"uris":["http://zotero.org/users/19861326/items/N3YG9DFB"],"itemData":{"id":14,"type":"webpage","container-title":"An Garda Síochána","title":"National Vetting Bureau - About eVetting","title-short":"About eVetting","URL":"https://vetting.garda.ie/Application/About","author":[{"literal":"National Vetting Bureau"}],"accessed":{"date-parts":[["2026",3,7]]}}}],"schema":"https://github.com/citation-style-language/schema/raw/master/csl-citation.json"} </w:instrText>
       </w:r>
       <w:r>
         <w:rPr>
@@ -5191,23 +5151,7 @@
           <w:sz w:val="24"/>
           <w:szCs w:val="24"/>
         </w:rPr>
-        <w:t xml:space="preserve">. While </w:t>
-      </w:r>
-      <w:proofErr w:type="spellStart"/>
-      <w:r>
-        <w:rPr>
-          <w:sz w:val="24"/>
-          <w:szCs w:val="24"/>
-        </w:rPr>
-        <w:t>eVetting</w:t>
-      </w:r>
-      <w:proofErr w:type="spellEnd"/>
-      <w:r>
-        <w:rPr>
-          <w:sz w:val="24"/>
-          <w:szCs w:val="24"/>
-        </w:rPr>
-        <w:t xml:space="preserve"> has improved processing efficiency, it does not address the issue of data reuse. Each application requires the volunteer to re-enter the same personal information from scratch, with no mechanism to retrieve or share previously submitted data between registered organisations.</w:t>
+        <w:t>. While eVetting has improved processing efficiency, it does not address the issue of data reuse. Each application requires the volunteer to re-enter the same personal information from scratch, with no mechanism to retrieve or share previously submitted data between registered organisations.</w:t>
       </w:r>
     </w:p>
     <w:p>
@@ -5255,7 +5199,7 @@
           <w:sz w:val="24"/>
           <w:szCs w:val="24"/>
         </w:rPr>
-        <w:instrText xml:space="preserve"> ADDIN ZOTERO_ITEM CSL_CITATION {"citationID":"UFxW7rzV","properties":{"unsorted":false,"formattedCitation":"(Cairn Community Games, 2025)","plainCitation":"(Cairn Community Games, 2025)","noteIndex":0},"citationItems":[{"id":7,"uris":["http://zotero.org/users/19861326/items/HPNZ8CEB"],"itemData":{"id":7,"type":"webpage","abstract":"Complete the necessary Garda Vetting process to ensure the safety and well-being of all participants.","language":"en","title":"Cairn Community Games - Garda Vetting","URL":"https://www.cairncommunitygames.ie/volunteers/vetting","author":[{"literal":"Cairn Community Games"}],"accessed":{"date-parts":[["2026",3,7]]},"issued":{"date-parts":[["2025"]]}}}],"schema":"https://github.com/citation-style-language/schema/raw/master/csl-citation.json"} </w:instrText>
+        <w:instrText xml:space="preserve"> ADDIN ZOTERO_ITEM CSL_CITATION {"citationID":"UFxW7rzV","properties":{"unsorted":false,"formattedCitation":"(Cairn Community Games, 2025)","plainCitation":"(Cairn Community Games, 2025)","noteIndex":0},"citationItems":[{"id":7,"uris":["http://zotero.org/users/19861326/items/HPNZ8CEB"],"itemData":{"id":7,"type":"webpage","abstract":"Complete the necessary Garda Vetting process to ensure the safety and well-being of all participants.","container-title":"Garda Vetting Process","language":"en","title":"Cairn Community Games","title-short":"Community Games Vetting Process","URL":"https://www.cairncommunitygames.ie/volunteers/vetting","author":[{"literal":"Cairn Community Games"}],"accessed":{"date-parts":[["2026",3,7]]},"issued":{"date-parts":[["2025"]]}}}],"schema":"https://github.com/citation-style-language/schema/raw/master/csl-citation.json"} </w:instrText>
       </w:r>
       <w:r>
         <w:rPr>
@@ -5283,39 +5227,7 @@
           <w:sz w:val="24"/>
           <w:szCs w:val="24"/>
         </w:rPr>
-        <w:t xml:space="preserve">. Similarly, Athletics Ireland requires volunteers to complete a paper </w:t>
-      </w:r>
-      <w:proofErr w:type="spellStart"/>
-      <w:r>
-        <w:rPr>
-          <w:sz w:val="24"/>
-          <w:szCs w:val="24"/>
-        </w:rPr>
-        <w:t>eVetting</w:t>
-      </w:r>
-      <w:proofErr w:type="spellEnd"/>
-      <w:r>
-        <w:rPr>
-          <w:sz w:val="24"/>
-          <w:szCs w:val="24"/>
-        </w:rPr>
-        <w:t xml:space="preserve"> Invitation and ID Validation form, present original identity documents to their Club Children's Officer, and post the completed form to the Athletics Ireland Liaison Person in Dublin, who then manually inputs the application into the </w:t>
-      </w:r>
-      <w:proofErr w:type="spellStart"/>
-      <w:r>
-        <w:rPr>
-          <w:sz w:val="24"/>
-          <w:szCs w:val="24"/>
-        </w:rPr>
-        <w:t>eVetting</w:t>
-      </w:r>
-      <w:proofErr w:type="spellEnd"/>
-      <w:r>
-        <w:rPr>
-          <w:sz w:val="24"/>
-          <w:szCs w:val="24"/>
-        </w:rPr>
-        <w:t xml:space="preserve"> portal </w:t>
+        <w:t xml:space="preserve">. Similarly, Athletics Ireland requires volunteers to complete a paper eVetting Invitation and ID Validation form, present original identity documents to their Club Children's Officer, and post the completed form to the Athletics Ireland Liaison Person in Dublin, who then manually inputs the application into the eVetting portal </w:t>
       </w:r>
       <w:r>
         <w:rPr>
@@ -5336,7 +5248,7 @@
           <w:sz w:val="24"/>
           <w:szCs w:val="24"/>
         </w:rPr>
-        <w:instrText xml:space="preserve"> ADDIN ZOTERO_ITEM CSL_CITATION {"citationID":"VjUJ1fvl","properties":{"unsorted":false,"formattedCitation":"(Athletics Ireland, 2026)","plainCitation":"(Athletics Ireland, 2026)","noteIndex":0},"citationItems":[{"id":9,"uris":["http://zotero.org/users/19861326/items/A7GWAMRM"],"itemData":{"id":9,"type":"post-weblog","container-title":"Athletics Ireland","language":"en-US","title":"Athletics Ireland - Garda Vetting Policy","URL":"https://www.athleticsireland.ie/child-welfare/garda-vetting-policy/","author":[{"literal":"Athletics Ireland"}],"accessed":{"date-parts":[["2026",3,7]]},"issued":{"date-parts":[["2026"]]}}}],"schema":"https://github.com/citation-style-language/schema/raw/master/csl-citation.json"} </w:instrText>
+        <w:instrText xml:space="preserve"> ADDIN ZOTERO_ITEM CSL_CITATION {"citationID":"VjUJ1fvl","properties":{"unsorted":false,"formattedCitation":"(Athletics Ireland, 2026)","plainCitation":"(Athletics Ireland, 2026)","noteIndex":0},"citationItems":[{"id":9,"uris":["http://zotero.org/users/19861326/items/A7GWAMRM"],"itemData":{"id":9,"type":"post-weblog","container-title":"Athletics Ireland","language":"en-US","title":"Athletics Ireland - Garda Vetting Policy","title-short":"Garda Vetting Policy","URL":"https://www.athleticsireland.ie/child-welfare/garda-vetting-policy/","author":[{"literal":"Athletics Ireland"}],"accessed":{"date-parts":[["2026",3,7]]},"issued":{"date-parts":[["2026"]]}}}],"schema":"https://github.com/citation-style-language/schema/raw/master/csl-citation.json"} </w:instrText>
       </w:r>
       <w:r>
         <w:rPr>
@@ -5350,6 +5262,63 @@
           <w:rFonts w:ascii="Calibri" w:hAnsi="Calibri" w:cs="Calibri"/>
           <w:sz w:val="24"/>
         </w:rPr>
+        <w:t xml:space="preserve">(Athletics </w:t>
+      </w:r>
+      <w:r>
+        <w:rPr>
+          <w:rFonts w:ascii="Calibri" w:hAnsi="Calibri" w:cs="Calibri"/>
+          <w:sz w:val="24"/>
+        </w:rPr>
+        <w:lastRenderedPageBreak/>
+        <w:t>Ireland, 2026)</w:t>
+      </w:r>
+      <w:r>
+        <w:rPr>
+          <w:sz w:val="24"/>
+          <w:szCs w:val="24"/>
+        </w:rPr>
+        <w:fldChar w:fldCharType="end"/>
+      </w:r>
+      <w:r>
+        <w:rPr>
+          <w:sz w:val="24"/>
+          <w:szCs w:val="24"/>
+        </w:rPr>
+        <w:t>. Athletics Ireland explicitly states that vetting is not transferable between sporting associations and must be renewed every three years</w:t>
+      </w:r>
+      <w:r>
+        <w:rPr>
+          <w:sz w:val="24"/>
+          <w:szCs w:val="24"/>
+        </w:rPr>
+        <w:t xml:space="preserve"> </w:t>
+      </w:r>
+      <w:r>
+        <w:rPr>
+          <w:sz w:val="24"/>
+          <w:szCs w:val="24"/>
+        </w:rPr>
+        <w:fldChar w:fldCharType="begin"/>
+      </w:r>
+      <w:r>
+        <w:rPr>
+          <w:sz w:val="24"/>
+          <w:szCs w:val="24"/>
+        </w:rPr>
+        <w:instrText xml:space="preserve"> ADDIN ZOTERO_ITEM CSL_CITATION {"citationID":"ONlywyoG","properties":{"unsorted":false,"formattedCitation":"(Athletics Ireland, 2026)","plainCitation":"(Athletics Ireland, 2026)","noteIndex":0},"citationItems":[{"id":9,"uris":["http://zotero.org/users/19861326/items/A7GWAMRM"],"itemData":{"id":9,"type":"post-weblog","container-title":"Athletics Ireland","language":"en-US","title":"Athletics Ireland - Garda Vetting Policy","title-short":"Garda Vetting Policy","URL":"https://www.athleticsireland.ie/child-welfare/garda-vetting-policy/","author":[{"literal":"Athletics Ireland"}],"accessed":{"date-parts":[["2026",3,7]]},"issued":{"date-parts":[["2026"]]}}}],"schema":"https://github.com/citation-style-language/schema/raw/master/csl-citation.json"} </w:instrText>
+      </w:r>
+      <w:r>
+        <w:rPr>
+          <w:sz w:val="24"/>
+          <w:szCs w:val="24"/>
+        </w:rPr>
+        <w:fldChar w:fldCharType="separate"/>
+      </w:r>
+      <w:r>
+        <w:rPr>
+          <w:rFonts w:ascii="Calibri" w:hAnsi="Calibri" w:cs="Calibri"/>
+          <w:sz w:val="24"/>
+        </w:rPr>
         <w:t>(Athletics Ireland, 2026)</w:t>
       </w:r>
       <w:r>
@@ -5364,15 +5333,7 @@
           <w:sz w:val="24"/>
           <w:szCs w:val="24"/>
         </w:rPr>
-        <w:t xml:space="preserve">. Athletics Ireland explicitly states that vetting is not transferable between </w:t>
-      </w:r>
-      <w:r>
-        <w:rPr>
-          <w:sz w:val="24"/>
-          <w:szCs w:val="24"/>
-        </w:rPr>
-        <w:lastRenderedPageBreak/>
-        <w:t>sporting associations and must be renewed every three years</w:t>
+        <w:t>.</w:t>
       </w:r>
       <w:r>
         <w:rPr>
@@ -5386,6 +5347,20 @@
           <w:sz w:val="24"/>
           <w:szCs w:val="24"/>
         </w:rPr>
+        <w:t>The Irish Government has itself acknowledged the limitations of the current system, establishing an interdepartmental group in 2021 to examine reform of Garda vetting arrangements, with a key focus on introducing mandatory re-vetting every three years</w:t>
+      </w:r>
+      <w:r>
+        <w:rPr>
+          <w:sz w:val="24"/>
+          <w:szCs w:val="24"/>
+        </w:rPr>
+        <w:t xml:space="preserve"> </w:t>
+      </w:r>
+      <w:r>
+        <w:rPr>
+          <w:sz w:val="24"/>
+          <w:szCs w:val="24"/>
+        </w:rPr>
         <w:fldChar w:fldCharType="begin"/>
       </w:r>
       <w:r>
@@ -5393,7 +5368,7 @@
           <w:sz w:val="24"/>
           <w:szCs w:val="24"/>
         </w:rPr>
-        <w:instrText xml:space="preserve"> ADDIN ZOTERO_ITEM CSL_CITATION {"citationID":"ONlywyoG","properties":{"unsorted":false,"formattedCitation":"(Athletics Ireland, 2026)","plainCitation":"(Athletics Ireland, 2026)","noteIndex":0},"citationItems":[{"id":9,"uris":["http://zotero.org/users/19861326/items/A7GWAMRM"],"itemData":{"id":9,"type":"post-weblog","container-title":"Athletics Ireland","language":"en-US","title":"Athletics Ireland - Garda Vetting Policy","URL":"https://www.athleticsireland.ie/child-welfare/garda-vetting-policy/","author":[{"literal":"Athletics Ireland"}],"accessed":{"date-parts":[["2026",3,7]]},"issued":{"date-parts":[["2026"]]}}}],"schema":"https://github.com/citation-style-language/schema/raw/master/csl-citation.json"} </w:instrText>
+        <w:instrText xml:space="preserve"> ADDIN ZOTERO_ITEM CSL_CITATION {"citationID":"lNfsh83J","properties":{"unsorted":false,"formattedCitation":"(Department of Justice, Home Affairs and Migration, 2021)","plainCitation":"(Department of Justice, Home Affairs and Migration, 2021)","noteIndex":0},"citationItems":[{"id":30,"uris":["http://zotero.org/users/19861326/items/333EHDUL"],"itemData":{"id":30,"type":"webpage","abstract":"A key focus of the interdepartmental group will be the introduction of a mandatory system of re-vetting every three years","container-title":"gov.ie","language":"en","title":"Minister McEntee moves to reform vetting arrangements and legislation","title-short":"Reform vetting arrangements and legislation","URL":"https://www.gov.ie/en/department-of-justice-home-affairs-and-migration/press-releases/minister-mcentee-moves-to-reform-vetting-arrangements-and-legislation/","author":[{"literal":"Department of Justice, Home Affairs and Migration"}],"accessed":{"date-parts":[["2026",3,14]]},"issued":{"date-parts":[["2021",4,26]]}}}],"schema":"https://github.com/citation-style-language/schema/raw/master/csl-citation.json"} </w:instrText>
       </w:r>
       <w:r>
         <w:rPr>
@@ -5407,7 +5382,7 @@
           <w:rFonts w:ascii="Calibri" w:hAnsi="Calibri" w:cs="Calibri"/>
           <w:sz w:val="24"/>
         </w:rPr>
-        <w:t>(Athletics Ireland, 2026)</w:t>
+        <w:t>(Department of Justice, Home Affairs and Migration, 2021)</w:t>
       </w:r>
       <w:r>
         <w:rPr>
@@ -5423,69 +5398,6 @@
         </w:rPr>
         <w:t>.</w:t>
       </w:r>
-      <w:r>
-        <w:rPr>
-          <w:sz w:val="24"/>
-          <w:szCs w:val="24"/>
-        </w:rPr>
-        <w:t xml:space="preserve"> </w:t>
-      </w:r>
-      <w:r>
-        <w:rPr>
-          <w:sz w:val="24"/>
-          <w:szCs w:val="24"/>
-        </w:rPr>
-        <w:t>The Irish Government has itself acknowledged the limitations of the current system, establishing an interdepartmental group in 2021 to examine reform of Garda vetting arrangements, with a key focus on introducing mandatory re-vetting every three years</w:t>
-      </w:r>
-      <w:r>
-        <w:rPr>
-          <w:sz w:val="24"/>
-          <w:szCs w:val="24"/>
-        </w:rPr>
-        <w:t xml:space="preserve"> </w:t>
-      </w:r>
-      <w:r>
-        <w:rPr>
-          <w:sz w:val="24"/>
-          <w:szCs w:val="24"/>
-        </w:rPr>
-        <w:fldChar w:fldCharType="begin"/>
-      </w:r>
-      <w:r>
-        <w:rPr>
-          <w:sz w:val="24"/>
-          <w:szCs w:val="24"/>
-        </w:rPr>
-        <w:instrText xml:space="preserve"> ADDIN ZOTERO_ITEM CSL_CITATION {"citationID":"lNfsh83J","properties":{"unsorted":false,"formattedCitation":"(Department of Justice, Home Affairs and Migration, 2021)","plainCitation":"(Department of Justice, Home Affairs and Migration, 2021)","noteIndex":0},"citationItems":[{"id":30,"uris":["http://zotero.org/users/19861326/items/333EHDUL"],"itemData":{"id":30,"type":"webpage","abstract":"A key focus of the interdepartmental group will be the introduction of a mandatory system of re-vetting every three years","container-title":"gov.ie","language":"en","title":"Minister McEntee moves to reform vetting arrangements and legislation","URL":"https://www.gov.ie/en/department-of-justice-home-affairs-and-migration/press-releases/minister-mcentee-moves-to-reform-vetting-arrangements-and-legislation/","author":[{"literal":"Department of Justice, Home Affairs and Migration"}],"accessed":{"date-parts":[["2026",3,14]]},"issued":{"date-parts":[["2021",4,26]]}}}],"schema":"https://github.com/citation-style-language/schema/raw/master/csl-citation.json"} </w:instrText>
-      </w:r>
-      <w:r>
-        <w:rPr>
-          <w:sz w:val="24"/>
-          <w:szCs w:val="24"/>
-        </w:rPr>
-        <w:fldChar w:fldCharType="separate"/>
-      </w:r>
-      <w:r>
-        <w:rPr>
-          <w:rFonts w:ascii="Calibri" w:hAnsi="Calibri" w:cs="Calibri"/>
-          <w:sz w:val="24"/>
-        </w:rPr>
-        <w:t>(Department of Justice, Home Affairs and Migration, 2021)</w:t>
-      </w:r>
-      <w:r>
-        <w:rPr>
-          <w:sz w:val="24"/>
-          <w:szCs w:val="24"/>
-        </w:rPr>
-        <w:fldChar w:fldCharType="end"/>
-      </w:r>
-      <w:r>
-        <w:rPr>
-          <w:sz w:val="24"/>
-          <w:szCs w:val="24"/>
-        </w:rPr>
-        <w:t>.</w:t>
-      </w:r>
     </w:p>
     <w:p>
       <w:pPr>
@@ -5511,23 +5423,7 @@
           <w:sz w:val="24"/>
           <w:szCs w:val="24"/>
         </w:rPr>
-        <w:t xml:space="preserve">These examples illustrate that despite the availability of </w:t>
-      </w:r>
-      <w:proofErr w:type="spellStart"/>
-      <w:r>
-        <w:rPr>
-          <w:sz w:val="24"/>
-          <w:szCs w:val="24"/>
-        </w:rPr>
-        <w:t>eVetting</w:t>
-      </w:r>
-      <w:proofErr w:type="spellEnd"/>
-      <w:r>
-        <w:rPr>
-          <w:sz w:val="24"/>
-          <w:szCs w:val="24"/>
-        </w:rPr>
-        <w:t xml:space="preserve">, the vetting landscape across Irish sporting and community organisations remains fragmented and burdensome for volunteers. No centralised mechanism currently exists to allow a volunteer to store their personal vetting data securely and share it across multiple registered organisations, resulting in repeated submission of the same sensitive personal information. </w:t>
+        <w:t xml:space="preserve">These examples illustrate that despite the availability of eVetting, the vetting landscape across Irish sporting and community organisations remains fragmented and burdensome for volunteers. No centralised mechanism currently exists to allow a volunteer to store their personal vetting data securely and share it across multiple registered organisations, resulting in repeated submission of the same sensitive personal information. </w:t>
       </w:r>
       <w:r>
         <w:rPr>
@@ -5624,6 +5520,22 @@
           <w:szCs w:val="24"/>
         </w:rPr>
       </w:pPr>
+    </w:p>
+    <w:p>
+      <w:pPr>
+        <w:spacing w:after="160" w:line="259" w:lineRule="auto"/>
+        <w:rPr>
+          <w:rFonts w:eastAsiaTheme="majorEastAsia" w:cstheme="majorBidi"/>
+          <w:b/>
+          <w:bCs/>
+          <w:sz w:val="32"/>
+          <w:szCs w:val="26"/>
+        </w:rPr>
+      </w:pPr>
+      <w:bookmarkStart w:id="15" w:name="_Toc76997404"/>
+      <w:r>
+        <w:br w:type="page"/>
+      </w:r>
     </w:p>
     <w:p>
       <w:pPr>
@@ -5634,9 +5546,9 @@
         </w:numPr>
         <w:ind w:left="851" w:hanging="851"/>
       </w:pPr>
-      <w:bookmarkStart w:id="15" w:name="_Toc76997404"/>
-      <w:bookmarkStart w:id="16" w:name="_Toc224392256"/>
-      <w:r>
+      <w:bookmarkStart w:id="16" w:name="_Toc224585263"/>
+      <w:r>
+        <w:lastRenderedPageBreak/>
         <w:t>Aims &amp; Objectives</w:t>
       </w:r>
       <w:bookmarkEnd w:id="15"/>
@@ -5656,15 +5568,7 @@
           <w:sz w:val="24"/>
           <w:szCs w:val="24"/>
         </w:rPr>
-        <w:t xml:space="preserve">The aim of this project is to design and develop a secure, web-based data reuse system that reduces the administrative burden placed on volunteers who are required to undergo Garda </w:t>
-      </w:r>
-      <w:r>
-        <w:rPr>
-          <w:sz w:val="24"/>
-          <w:szCs w:val="24"/>
-        </w:rPr>
-        <w:lastRenderedPageBreak/>
-        <w:t>Vetting across multiple organisations, whilst enabling the safe and controlled sharing of personal vetting data in accordance with GDPR principles.</w:t>
+        <w:t>The aim of this project is to design and develop a secure, web-based data reuse system that reduces the administrative burden placed on volunteers who are required to undergo Garda Vetting across multiple organisations, whilst enabling the safe and controlled sharing of personal vetting data in accordance with GDPR principles.</w:t>
       </w:r>
     </w:p>
     <w:p>
@@ -5855,7 +5759,7 @@
         <w:ind w:left="851" w:hanging="851"/>
       </w:pPr>
       <w:bookmarkStart w:id="17" w:name="_Toc76997405"/>
-      <w:bookmarkStart w:id="18" w:name="_Toc224392257"/>
+      <w:bookmarkStart w:id="18" w:name="_Toc224585264"/>
       <w:r>
         <w:t>Report Outline</w:t>
       </w:r>
@@ -5902,7 +5806,7 @@
           <w:bCs/>
         </w:rPr>
       </w:pPr>
-      <w:bookmarkStart w:id="19" w:name="_Toc224392258"/>
+      <w:bookmarkStart w:id="19" w:name="_Toc224585265"/>
       <w:r>
         <w:rPr>
           <w:b/>
@@ -5956,12 +5860,13 @@
           <w:bCs/>
         </w:rPr>
       </w:pPr>
-      <w:bookmarkStart w:id="20" w:name="_Toc224392259"/>
+      <w:bookmarkStart w:id="20" w:name="_Toc224585266"/>
       <w:r>
         <w:rPr>
           <w:b/>
           <w:bCs/>
         </w:rPr>
+        <w:lastRenderedPageBreak/>
         <w:t>Implementation</w:t>
       </w:r>
       <w:bookmarkEnd w:id="20"/>
@@ -5980,15 +5885,7 @@
           <w:sz w:val="24"/>
           <w:szCs w:val="24"/>
         </w:rPr>
-        <w:t xml:space="preserve">This chapter describes the development of the system, including the technologies and frameworks selected, the rationale for key design decisions, and the implementation of core </w:t>
-      </w:r>
-      <w:r>
-        <w:rPr>
-          <w:sz w:val="24"/>
-          <w:szCs w:val="24"/>
-        </w:rPr>
-        <w:lastRenderedPageBreak/>
-        <w:t>features such as user authentication, secure data storage, and the access code sharing mechanism.</w:t>
+        <w:t>This chapter describes the development of the system, including the technologies and frameworks selected, the rationale for key design decisions, and the implementation of core features such as user authentication, secure data storage, and the access code sharing mechanism.</w:t>
       </w:r>
     </w:p>
     <w:p>
@@ -6018,7 +5915,7 @@
           <w:bCs/>
         </w:rPr>
       </w:pPr>
-      <w:bookmarkStart w:id="21" w:name="_Toc224392260"/>
+      <w:bookmarkStart w:id="21" w:name="_Toc224585267"/>
       <w:r>
         <w:rPr>
           <w:b/>
@@ -6072,7 +5969,7 @@
           <w:bCs/>
         </w:rPr>
       </w:pPr>
-      <w:bookmarkStart w:id="22" w:name="_Toc224392261"/>
+      <w:bookmarkStart w:id="22" w:name="_Toc224585268"/>
       <w:r>
         <w:rPr>
           <w:b/>
@@ -6205,11 +6102,21 @@
       <w:r>
         <w:t xml:space="preserve">Figure </w:t>
       </w:r>
-      <w:fldSimple w:instr=" SEQ Figure \* ARABIC ">
-        <w:r>
-          <w:t>1</w:t>
-        </w:r>
-      </w:fldSimple>
+      <w:r>
+        <w:fldChar w:fldCharType="begin"/>
+      </w:r>
+      <w:r>
+        <w:instrText xml:space="preserve"> SEQ Figure \* ARABIC </w:instrText>
+      </w:r>
+      <w:r>
+        <w:fldChar w:fldCharType="separate"/>
+      </w:r>
+      <w:r>
+        <w:t>1</w:t>
+      </w:r>
+      <w:r>
+        <w:fldChar w:fldCharType="end"/>
+      </w:r>
       <w:r>
         <w:t xml:space="preserve"> </w:t>
       </w:r>
@@ -6357,11 +6264,21 @@
       <w:r>
         <w:t xml:space="preserve">Figure </w:t>
       </w:r>
-      <w:fldSimple w:instr=" SEQ Figure \* ARABIC ">
-        <w:r>
-          <w:t>2</w:t>
-        </w:r>
-      </w:fldSimple>
+      <w:r>
+        <w:fldChar w:fldCharType="begin"/>
+      </w:r>
+      <w:r>
+        <w:instrText xml:space="preserve"> SEQ Figure \* ARABIC </w:instrText>
+      </w:r>
+      <w:r>
+        <w:fldChar w:fldCharType="separate"/>
+      </w:r>
+      <w:r>
+        <w:t>2</w:t>
+      </w:r>
+      <w:r>
+        <w:fldChar w:fldCharType="end"/>
+      </w:r>
       <w:r>
         <w:t xml:space="preserve"> </w:t>
       </w:r>
@@ -6403,7 +6320,7 @@
         </w:numPr>
         <w:ind w:left="567" w:hanging="567"/>
       </w:pPr>
-      <w:bookmarkStart w:id="25" w:name="_Toc224392262"/>
+      <w:bookmarkStart w:id="25" w:name="_Toc224585269"/>
       <w:r>
         <w:lastRenderedPageBreak/>
         <w:t>Chapter Name</w:t>
@@ -6572,7 +6489,7 @@
         <w:ind w:left="851" w:hanging="851"/>
       </w:pPr>
       <w:bookmarkStart w:id="26" w:name="_Toc76997407"/>
-      <w:bookmarkStart w:id="27" w:name="_Toc224392263"/>
+      <w:bookmarkStart w:id="27" w:name="_Toc224585270"/>
       <w:r>
         <w:t>Additional Chapters guide</w:t>
       </w:r>
@@ -6632,23 +6549,7 @@
           <w:sz w:val="24"/>
           <w:szCs w:val="24"/>
         </w:rPr>
-        <w:t xml:space="preserve">System requirements – Functional, </w:t>
-      </w:r>
-      <w:proofErr w:type="spellStart"/>
-      <w:r>
-        <w:rPr>
-          <w:sz w:val="24"/>
-          <w:szCs w:val="24"/>
-        </w:rPr>
-        <w:t>Non functional</w:t>
-      </w:r>
-      <w:proofErr w:type="spellEnd"/>
-      <w:r>
-        <w:rPr>
-          <w:sz w:val="24"/>
-          <w:szCs w:val="24"/>
-        </w:rPr>
-        <w:t xml:space="preserve"> requir</w:t>
+        <w:t>System requirements – Functional, Non functional requir</w:t>
       </w:r>
       <w:r>
         <w:rPr>
@@ -7139,11 +7040,21 @@
       <w:r>
         <w:t xml:space="preserve">Figure </w:t>
       </w:r>
-      <w:fldSimple w:instr=" SEQ Figure \* ARABIC ">
-        <w:r>
-          <w:t>1</w:t>
-        </w:r>
-      </w:fldSimple>
+      <w:r>
+        <w:fldChar w:fldCharType="begin"/>
+      </w:r>
+      <w:r>
+        <w:instrText xml:space="preserve"> SEQ Figure \* ARABIC </w:instrText>
+      </w:r>
+      <w:r>
+        <w:fldChar w:fldCharType="separate"/>
+      </w:r>
+      <w:r>
+        <w:t>1</w:t>
+      </w:r>
+      <w:r>
+        <w:fldChar w:fldCharType="end"/>
+      </w:r>
       <w:r>
         <w:t xml:space="preserve"> </w:t>
       </w:r>
@@ -7282,11 +7193,21 @@
       <w:r>
         <w:t xml:space="preserve">Figure </w:t>
       </w:r>
-      <w:fldSimple w:instr=" SEQ Figure \* ARABIC ">
-        <w:r>
-          <w:t>2</w:t>
-        </w:r>
-      </w:fldSimple>
+      <w:r>
+        <w:fldChar w:fldCharType="begin"/>
+      </w:r>
+      <w:r>
+        <w:instrText xml:space="preserve"> SEQ Figure \* ARABIC </w:instrText>
+      </w:r>
+      <w:r>
+        <w:fldChar w:fldCharType="separate"/>
+      </w:r>
+      <w:r>
+        <w:t>2</w:t>
+      </w:r>
+      <w:r>
+        <w:fldChar w:fldCharType="end"/>
+      </w:r>
       <w:r>
         <w:t xml:space="preserve"> </w:t>
       </w:r>
@@ -7337,7 +7258,7 @@
         </w:numPr>
         <w:ind w:hanging="792"/>
       </w:pPr>
-      <w:bookmarkStart w:id="28" w:name="_Toc224392264"/>
+      <w:bookmarkStart w:id="28" w:name="_Toc224585271"/>
       <w:r>
         <w:t>Report Outline</w:t>
       </w:r>
@@ -7470,7 +7391,7 @@
         </w:numPr>
         <w:ind w:left="851" w:hanging="851"/>
       </w:pPr>
-      <w:bookmarkStart w:id="29" w:name="_Toc224392265"/>
+      <w:bookmarkStart w:id="29" w:name="_Toc224585272"/>
       <w:r>
         <w:t>Tables</w:t>
       </w:r>
@@ -8052,7 +7973,7 @@
         </w:numPr>
         <w:ind w:left="851" w:hanging="851"/>
       </w:pPr>
-      <w:bookmarkStart w:id="32" w:name="_Toc224392266"/>
+      <w:bookmarkStart w:id="32" w:name="_Toc224585273"/>
       <w:r>
         <w:t>Code and Formulae</w:t>
       </w:r>
@@ -8132,41 +8053,13 @@
           <w:szCs w:val="24"/>
         </w:rPr>
       </w:pPr>
-      <w:proofErr w:type="spellStart"/>
       <w:r>
         <w:rPr>
           <w:rFonts w:asciiTheme="majorHAnsi" w:hAnsiTheme="majorHAnsi"/>
           <w:sz w:val="20"/>
           <w:szCs w:val="24"/>
         </w:rPr>
-        <w:t>TextMessage</w:t>
-      </w:r>
-      <w:proofErr w:type="spellEnd"/>
-      <w:r>
-        <w:rPr>
-          <w:rFonts w:asciiTheme="majorHAnsi" w:hAnsiTheme="majorHAnsi"/>
-          <w:sz w:val="20"/>
-          <w:szCs w:val="24"/>
-        </w:rPr>
-        <w:t xml:space="preserve"> </w:t>
-      </w:r>
-      <w:proofErr w:type="spellStart"/>
-      <w:r>
-        <w:rPr>
-          <w:rFonts w:asciiTheme="majorHAnsi" w:hAnsiTheme="majorHAnsi"/>
-          <w:sz w:val="20"/>
-          <w:szCs w:val="24"/>
-        </w:rPr>
-        <w:t>msg</w:t>
-      </w:r>
-      <w:proofErr w:type="spellEnd"/>
-      <w:r>
-        <w:rPr>
-          <w:rFonts w:asciiTheme="majorHAnsi" w:hAnsiTheme="majorHAnsi"/>
-          <w:sz w:val="20"/>
-          <w:szCs w:val="24"/>
-        </w:rPr>
-        <w:t xml:space="preserve"> = null;</w:t>
+        <w:t>TextMessage msg = null;</w:t>
       </w:r>
     </w:p>
     <w:p>
@@ -8220,43 +8113,7 @@
           <w:sz w:val="20"/>
           <w:szCs w:val="24"/>
         </w:rPr>
-        <w:t xml:space="preserve">            if (message </w:t>
-      </w:r>
-      <w:proofErr w:type="spellStart"/>
-      <w:r>
-        <w:rPr>
-          <w:rFonts w:asciiTheme="majorHAnsi" w:hAnsiTheme="majorHAnsi"/>
-          <w:sz w:val="20"/>
-          <w:szCs w:val="24"/>
-        </w:rPr>
-        <w:t>instanceof</w:t>
-      </w:r>
-      <w:proofErr w:type="spellEnd"/>
-      <w:r>
-        <w:rPr>
-          <w:rFonts w:asciiTheme="majorHAnsi" w:hAnsiTheme="majorHAnsi"/>
-          <w:sz w:val="20"/>
-          <w:szCs w:val="24"/>
-        </w:rPr>
-        <w:t xml:space="preserve"> </w:t>
-      </w:r>
-      <w:proofErr w:type="spellStart"/>
-      <w:r>
-        <w:rPr>
-          <w:rFonts w:asciiTheme="majorHAnsi" w:hAnsiTheme="majorHAnsi"/>
-          <w:sz w:val="20"/>
-          <w:szCs w:val="24"/>
-        </w:rPr>
-        <w:t>TextMessage</w:t>
-      </w:r>
-      <w:proofErr w:type="spellEnd"/>
-      <w:r>
-        <w:rPr>
-          <w:rFonts w:asciiTheme="majorHAnsi" w:hAnsiTheme="majorHAnsi"/>
-          <w:sz w:val="20"/>
-          <w:szCs w:val="24"/>
-        </w:rPr>
-        <w:t>) {</w:t>
+        <w:t xml:space="preserve">            if (message instanceof TextMessage) {</w:t>
       </w:r>
     </w:p>
     <w:p>
@@ -8283,43 +8140,7 @@
           <w:sz w:val="20"/>
           <w:szCs w:val="24"/>
         </w:rPr>
-        <w:t xml:space="preserve">                </w:t>
-      </w:r>
-      <w:proofErr w:type="spellStart"/>
-      <w:r>
-        <w:rPr>
-          <w:rFonts w:asciiTheme="majorHAnsi" w:hAnsiTheme="majorHAnsi"/>
-          <w:sz w:val="20"/>
-          <w:szCs w:val="24"/>
-        </w:rPr>
-        <w:t>msg</w:t>
-      </w:r>
-      <w:proofErr w:type="spellEnd"/>
-      <w:r>
-        <w:rPr>
-          <w:rFonts w:asciiTheme="majorHAnsi" w:hAnsiTheme="majorHAnsi"/>
-          <w:sz w:val="20"/>
-          <w:szCs w:val="24"/>
-        </w:rPr>
-        <w:t xml:space="preserve"> = (</w:t>
-      </w:r>
-      <w:proofErr w:type="spellStart"/>
-      <w:r>
-        <w:rPr>
-          <w:rFonts w:asciiTheme="majorHAnsi" w:hAnsiTheme="majorHAnsi"/>
-          <w:sz w:val="20"/>
-          <w:szCs w:val="24"/>
-        </w:rPr>
-        <w:t>TextMessage</w:t>
-      </w:r>
-      <w:proofErr w:type="spellEnd"/>
-      <w:r>
-        <w:rPr>
-          <w:rFonts w:asciiTheme="majorHAnsi" w:hAnsiTheme="majorHAnsi"/>
-          <w:sz w:val="20"/>
-          <w:szCs w:val="24"/>
-        </w:rPr>
-        <w:t>) message;</w:t>
+        <w:t xml:space="preserve">                msg = (TextMessage) message;</w:t>
       </w:r>
     </w:p>
     <w:p>
@@ -8346,25 +8167,7 @@
           <w:sz w:val="20"/>
           <w:szCs w:val="24"/>
         </w:rPr>
-        <w:t xml:space="preserve">                </w:t>
-      </w:r>
-      <w:proofErr w:type="spellStart"/>
-      <w:r>
-        <w:rPr>
-          <w:rFonts w:asciiTheme="majorHAnsi" w:hAnsiTheme="majorHAnsi"/>
-          <w:sz w:val="20"/>
-          <w:szCs w:val="24"/>
-        </w:rPr>
-        <w:t>System.out.println</w:t>
-      </w:r>
-      <w:proofErr w:type="spellEnd"/>
-      <w:r>
-        <w:rPr>
-          <w:rFonts w:asciiTheme="majorHAnsi" w:hAnsiTheme="majorHAnsi"/>
-          <w:sz w:val="20"/>
-          <w:szCs w:val="24"/>
-        </w:rPr>
-        <w:t>("A Message received in TMDB: "</w:t>
+        <w:t xml:space="preserve">                System.out.println("A Message received in TMDB: "</w:t>
       </w:r>
     </w:p>
     <w:p>
@@ -8392,25 +8195,7 @@
           <w:szCs w:val="24"/>
         </w:rPr>
         <w:lastRenderedPageBreak/>
-        <w:t xml:space="preserve">                                                    + </w:t>
-      </w:r>
-      <w:proofErr w:type="spellStart"/>
-      <w:r>
-        <w:rPr>
-          <w:rFonts w:asciiTheme="majorHAnsi" w:hAnsiTheme="majorHAnsi"/>
-          <w:sz w:val="20"/>
-          <w:szCs w:val="24"/>
-        </w:rPr>
-        <w:t>msg.getText</w:t>
-      </w:r>
-      <w:proofErr w:type="spellEnd"/>
-      <w:r>
-        <w:rPr>
-          <w:rFonts w:asciiTheme="majorHAnsi" w:hAnsiTheme="majorHAnsi"/>
-          <w:sz w:val="20"/>
-          <w:szCs w:val="24"/>
-        </w:rPr>
-        <w:t>());</w:t>
+        <w:t xml:space="preserve">                                                    + msg.getText());</w:t>
       </w:r>
     </w:p>
     <w:p>
@@ -8491,25 +8276,7 @@
           <w:sz w:val="20"/>
           <w:szCs w:val="24"/>
         </w:rPr>
-        <w:t xml:space="preserve">               </w:t>
-      </w:r>
-      <w:proofErr w:type="spellStart"/>
-      <w:r>
-        <w:rPr>
-          <w:rFonts w:asciiTheme="majorHAnsi" w:hAnsiTheme="majorHAnsi"/>
-          <w:sz w:val="20"/>
-          <w:szCs w:val="24"/>
-        </w:rPr>
-        <w:t>System.out.println</w:t>
-      </w:r>
-      <w:proofErr w:type="spellEnd"/>
-      <w:r>
-        <w:rPr>
-          <w:rFonts w:asciiTheme="majorHAnsi" w:hAnsiTheme="majorHAnsi"/>
-          <w:sz w:val="20"/>
-          <w:szCs w:val="24"/>
-        </w:rPr>
-        <w:t>("Message of wrong type: "</w:t>
+        <w:t xml:space="preserve">               System.out.println("Message of wrong type: "</w:t>
       </w:r>
     </w:p>
     <w:p>
@@ -8536,43 +8303,7 @@
           <w:sz w:val="20"/>
           <w:szCs w:val="24"/>
         </w:rPr>
-        <w:t xml:space="preserve">                                            + </w:t>
-      </w:r>
-      <w:proofErr w:type="spellStart"/>
-      <w:r>
-        <w:rPr>
-          <w:rFonts w:asciiTheme="majorHAnsi" w:hAnsiTheme="majorHAnsi"/>
-          <w:sz w:val="20"/>
-          <w:szCs w:val="24"/>
-        </w:rPr>
-        <w:t>message.getClass</w:t>
-      </w:r>
-      <w:proofErr w:type="spellEnd"/>
-      <w:r>
-        <w:rPr>
-          <w:rFonts w:asciiTheme="majorHAnsi" w:hAnsiTheme="majorHAnsi"/>
-          <w:sz w:val="20"/>
-          <w:szCs w:val="24"/>
-        </w:rPr>
-        <w:t>().</w:t>
-      </w:r>
-      <w:proofErr w:type="spellStart"/>
-      <w:r>
-        <w:rPr>
-          <w:rFonts w:asciiTheme="majorHAnsi" w:hAnsiTheme="majorHAnsi"/>
-          <w:sz w:val="20"/>
-          <w:szCs w:val="24"/>
-        </w:rPr>
-        <w:t>getName</w:t>
-      </w:r>
-      <w:proofErr w:type="spellEnd"/>
-      <w:r>
-        <w:rPr>
-          <w:rFonts w:asciiTheme="majorHAnsi" w:hAnsiTheme="majorHAnsi"/>
-          <w:sz w:val="20"/>
-          <w:szCs w:val="24"/>
-        </w:rPr>
-        <w:t>());</w:t>
+        <w:t xml:space="preserve">                                            + message.getClass().getName());</w:t>
       </w:r>
     </w:p>
     <w:p>
@@ -8626,25 +8357,7 @@
           <w:sz w:val="20"/>
           <w:szCs w:val="24"/>
         </w:rPr>
-        <w:t xml:space="preserve">        } catch (</w:t>
-      </w:r>
-      <w:proofErr w:type="spellStart"/>
-      <w:r>
-        <w:rPr>
-          <w:rFonts w:asciiTheme="majorHAnsi" w:hAnsiTheme="majorHAnsi"/>
-          <w:sz w:val="20"/>
-          <w:szCs w:val="24"/>
-        </w:rPr>
-        <w:t>JMSException</w:t>
-      </w:r>
-      <w:proofErr w:type="spellEnd"/>
-      <w:r>
-        <w:rPr>
-          <w:rFonts w:asciiTheme="majorHAnsi" w:hAnsiTheme="majorHAnsi"/>
-          <w:sz w:val="20"/>
-          <w:szCs w:val="24"/>
-        </w:rPr>
-        <w:t xml:space="preserve"> e) {</w:t>
+        <w:t xml:space="preserve">        } catch (JMSException e) {</w:t>
       </w:r>
     </w:p>
     <w:p>
@@ -8671,25 +8384,7 @@
           <w:sz w:val="20"/>
           <w:szCs w:val="24"/>
         </w:rPr>
-        <w:t xml:space="preserve">            </w:t>
-      </w:r>
-      <w:proofErr w:type="spellStart"/>
-      <w:r>
-        <w:rPr>
-          <w:rFonts w:asciiTheme="majorHAnsi" w:hAnsiTheme="majorHAnsi"/>
-          <w:sz w:val="20"/>
-          <w:szCs w:val="24"/>
-        </w:rPr>
-        <w:t>e.printStackTrace</w:t>
-      </w:r>
-      <w:proofErr w:type="spellEnd"/>
-      <w:r>
-        <w:rPr>
-          <w:rFonts w:asciiTheme="majorHAnsi" w:hAnsiTheme="majorHAnsi"/>
-          <w:sz w:val="20"/>
-          <w:szCs w:val="24"/>
-        </w:rPr>
-        <w:t>();</w:t>
+        <w:t xml:space="preserve">            e.printStackTrace();</w:t>
       </w:r>
     </w:p>
     <w:p>
@@ -8716,25 +8411,7 @@
           <w:sz w:val="20"/>
           <w:szCs w:val="24"/>
         </w:rPr>
-        <w:t xml:space="preserve">            </w:t>
-      </w:r>
-      <w:proofErr w:type="spellStart"/>
-      <w:r>
-        <w:rPr>
-          <w:rFonts w:asciiTheme="majorHAnsi" w:hAnsiTheme="majorHAnsi"/>
-          <w:sz w:val="20"/>
-          <w:szCs w:val="24"/>
-        </w:rPr>
-        <w:t>mdc.setRollbackOnly</w:t>
-      </w:r>
-      <w:proofErr w:type="spellEnd"/>
-      <w:r>
-        <w:rPr>
-          <w:rFonts w:asciiTheme="majorHAnsi" w:hAnsiTheme="majorHAnsi"/>
-          <w:sz w:val="20"/>
-          <w:szCs w:val="24"/>
-        </w:rPr>
-        <w:t>();</w:t>
+        <w:t xml:space="preserve">            mdc.setRollbackOnly();</w:t>
       </w:r>
     </w:p>
     <w:p>
@@ -8761,25 +8438,7 @@
           <w:sz w:val="20"/>
           <w:szCs w:val="24"/>
         </w:rPr>
-        <w:t xml:space="preserve">        } catch (Throwable </w:t>
-      </w:r>
-      <w:proofErr w:type="spellStart"/>
-      <w:r>
-        <w:rPr>
-          <w:rFonts w:asciiTheme="majorHAnsi" w:hAnsiTheme="majorHAnsi"/>
-          <w:sz w:val="20"/>
-          <w:szCs w:val="24"/>
-        </w:rPr>
-        <w:t>te</w:t>
-      </w:r>
-      <w:proofErr w:type="spellEnd"/>
-      <w:r>
-        <w:rPr>
-          <w:rFonts w:asciiTheme="majorHAnsi" w:hAnsiTheme="majorHAnsi"/>
-          <w:sz w:val="20"/>
-          <w:szCs w:val="24"/>
-        </w:rPr>
-        <w:t>) {</w:t>
+        <w:t xml:space="preserve">        } catch (Throwable te) {</w:t>
       </w:r>
     </w:p>
     <w:p>
@@ -8806,25 +8465,7 @@
           <w:sz w:val="20"/>
           <w:szCs w:val="24"/>
         </w:rPr>
-        <w:t xml:space="preserve">            </w:t>
-      </w:r>
-      <w:proofErr w:type="spellStart"/>
-      <w:r>
-        <w:rPr>
-          <w:rFonts w:asciiTheme="majorHAnsi" w:hAnsiTheme="majorHAnsi"/>
-          <w:sz w:val="20"/>
-          <w:szCs w:val="24"/>
-        </w:rPr>
-        <w:t>te.printStackTrace</w:t>
-      </w:r>
-      <w:proofErr w:type="spellEnd"/>
-      <w:r>
-        <w:rPr>
-          <w:rFonts w:asciiTheme="majorHAnsi" w:hAnsiTheme="majorHAnsi"/>
-          <w:sz w:val="20"/>
-          <w:szCs w:val="24"/>
-        </w:rPr>
-        <w:t>();</w:t>
+        <w:t xml:space="preserve">            te.printStackTrace();</w:t>
       </w:r>
     </w:p>
     <w:p>
@@ -8905,10 +8546,14 @@
         <w:pStyle w:val="Caption"/>
         <w:rPr>
           <w:szCs w:val="24"/>
+          <w:lang w:val="da-DK"/>
         </w:rPr>
       </w:pPr>
       <w:bookmarkStart w:id="33" w:name="_Toc429428842"/>
       <w:r>
+        <w:rPr>
+          <w:lang w:val="da-DK"/>
+        </w:rPr>
         <w:t xml:space="preserve">Code Listing </w:t>
       </w:r>
       <w:r>
@@ -8920,6 +8565,7 @@
       <w:r>
         <w:rPr>
           <w:noProof/>
+          <w:lang w:val="da-DK"/>
         </w:rPr>
         <w:instrText xml:space="preserve"> SEQ Code_Listing \* ARABIC </w:instrText>
       </w:r>
@@ -8932,6 +8578,7 @@
       <w:r>
         <w:rPr>
           <w:noProof/>
+          <w:lang w:val="da-DK"/>
         </w:rPr>
         <w:t>1</w:t>
       </w:r>
@@ -8942,15 +8589,10 @@
         <w:fldChar w:fldCharType="end"/>
       </w:r>
       <w:r>
-        <w:t xml:space="preserve"> </w:t>
-      </w:r>
-      <w:proofErr w:type="spellStart"/>
-      <w:r>
-        <w:t>MDBean</w:t>
-      </w:r>
-      <w:proofErr w:type="spellEnd"/>
-      <w:r>
-        <w:t xml:space="preserve"> Message Handling</w:t>
+        <w:rPr>
+          <w:lang w:val="da-DK"/>
+        </w:rPr>
+        <w:t xml:space="preserve"> MDBean Message Handling</w:t>
       </w:r>
       <w:bookmarkEnd w:id="33"/>
     </w:p>
@@ -8961,6 +8603,7 @@
         <w:rPr>
           <w:sz w:val="24"/>
           <w:szCs w:val="24"/>
+          <w:lang w:val="da-DK"/>
         </w:rPr>
       </w:pPr>
     </w:p>
@@ -9340,7 +8983,7 @@
         <w:spacing w:before="0" w:line="360" w:lineRule="auto"/>
         <w:ind w:left="567" w:hanging="567"/>
       </w:pPr>
-      <w:bookmarkStart w:id="34" w:name="_Toc224392267"/>
+      <w:bookmarkStart w:id="34" w:name="_Toc224585274"/>
       <w:r>
         <w:lastRenderedPageBreak/>
         <w:t>References</w:t>
@@ -9368,7 +9011,7 @@
           <w:i/>
           <w:iCs/>
         </w:rPr>
-        <w:t>Garda National Vetting Bureau</w:t>
+        <w:t>Garda National Vetting Bureau (GNVB)</w:t>
       </w:r>
       <w:r>
         <w:t xml:space="preserve">, </w:t>
@@ -9378,7 +9021,7 @@
           <w:i/>
           <w:iCs/>
         </w:rPr>
-        <w:t>Garda</w:t>
+        <w:t>An Garda Síochána</w:t>
       </w:r>
       <w:r>
         <w:t>. Available at: https://www.garda.ie/en/about-us/organised-serious-crime/garda-national-vetting-bureau-gnvb-/ (Accessed: 7 March 2026).</w:t>
@@ -9414,28 +9057,20 @@
           <w:i/>
           <w:iCs/>
         </w:rPr>
-        <w:t>Cairn Community Games - Garda Vetting</w:t>
-      </w:r>
-      <w:r>
-        <w:t>. Available at: https://www.cairncommunitygames.ie/volunteers/vetting (Accessed: 7 March 2026).</w:t>
-      </w:r>
-    </w:p>
-    <w:p>
-      <w:pPr>
-        <w:pStyle w:val="Bibliography"/>
-      </w:pPr>
-      <w:r>
-        <w:t xml:space="preserve">Central Statistics Office (2024) </w:t>
+        <w:t>Cairn Community Games</w:t>
+      </w:r>
+      <w:r>
+        <w:t xml:space="preserve">, </w:t>
       </w:r>
       <w:r>
         <w:rPr>
           <w:i/>
           <w:iCs/>
         </w:rPr>
-        <w:t>Key Findings Census of Population 2022 Spotlight Series: Volunteering in Ireland - Central Statistics Office</w:t>
-      </w:r>
-      <w:r>
-        <w:t>. CSO. Available at: https://www.cso.ie/en/releasesandpublications/ep/p-cpsv/censusofpopulation2022spotlightseriesvolunteeringinireland/keyfindings/ (Accessed: 6 March 2026).</w:t>
+        <w:t>Garda Vetting Process</w:t>
+      </w:r>
+      <w:r>
+        <w:t>. Available at: https://www.cairncommunitygames.ie/volunteers/vetting (Accessed: 7 March 2026).</w:t>
       </w:r>
     </w:p>
     <w:p>
@@ -9443,17 +9078,17 @@
         <w:pStyle w:val="Bibliography"/>
       </w:pPr>
       <w:r>
-        <w:t xml:space="preserve">Data Protection Commission (2021) </w:t>
+        <w:t xml:space="preserve">Central Statistics Office (2024) </w:t>
       </w:r>
       <w:r>
         <w:rPr>
           <w:i/>
           <w:iCs/>
         </w:rPr>
-        <w:t>Garda Vetting – Some Data Protection Considerations</w:t>
-      </w:r>
-      <w:r>
-        <w:t>. Available at: https://www.dataprotection.ie/sites/default/files/uploads/2021-05/Garda%20Vetting%20April%202021..pdf (Accessed: 14 March 2026).</w:t>
+        <w:t>Key Findings Census of Population 2022 Spotlight Series: Volunteering in Ireland</w:t>
+      </w:r>
+      <w:r>
+        <w:t>. CSO. Available at: https://www.cso.ie/en/releasesandpublications/ep/p-cpsv/censusofpopulation2022spotlightseriesvolunteeringinireland/keyfindings/ (Accessed: 6 March 2026).</w:t>
       </w:r>
     </w:p>
     <w:p>
@@ -9461,70 +9096,126 @@
         <w:pStyle w:val="Bibliography"/>
       </w:pPr>
       <w:r>
-        <w:t xml:space="preserve">Department of Justice, Home Affairs and Migration (2021) </w:t>
+        <w:t xml:space="preserve">Data Protection Commission (2021) </w:t>
       </w:r>
       <w:r>
         <w:rPr>
           <w:i/>
           <w:iCs/>
         </w:rPr>
-        <w:t>Minister McEntee moves to reform vetting arrangements and legislation</w:t>
-      </w:r>
-      <w:r>
-        <w:t xml:space="preserve">, </w:t>
+        <w:t>Garda Vetting – Some Data Protection Considerations</w:t>
+      </w:r>
+      <w:r>
+        <w:t>. Available at: https://www.dataprotection.ie/sites/default/files/uploads/2021-05/Garda%20Vetting%20April%202021..pdf (Accessed: 14 March 2026).</w:t>
+      </w:r>
+    </w:p>
+    <w:p>
+      <w:pPr>
+        <w:pStyle w:val="Bibliography"/>
+      </w:pPr>
+      <w:r>
+        <w:t xml:space="preserve">Department of Justice, Home Affairs and Migration (2021) </w:t>
       </w:r>
       <w:r>
         <w:rPr>
           <w:i/>
           <w:iCs/>
         </w:rPr>
-        <w:t>gov.ie</w:t>
-      </w:r>
-      <w:r>
-        <w:t>. Available at: https://www.gov.ie/en/department-of-justice-home-affairs-and-migration/press-releases/minister-mcentee-moves-to-reform-vetting-arrangements-and-legislation/ (Accessed: 14 March 2026).</w:t>
-      </w:r>
-    </w:p>
-    <w:p>
-      <w:pPr>
-        <w:pStyle w:val="Bibliography"/>
-      </w:pPr>
-      <w:r>
-        <w:t xml:space="preserve">Department of Rural and Community Development (2021) </w:t>
+        <w:t>Minister McEntee moves to reform vetting arrangements and legislation</w:t>
+      </w:r>
+      <w:r>
+        <w:t xml:space="preserve">, </w:t>
       </w:r>
       <w:r>
         <w:rPr>
           <w:i/>
           <w:iCs/>
         </w:rPr>
-        <w:t>National Volunteering Strategy (2021 - 2025)</w:t>
-      </w:r>
-      <w:r>
-        <w:t xml:space="preserve">, </w:t>
+        <w:t>gov.ie</w:t>
+      </w:r>
+      <w:r>
+        <w:t>. Available at: https://www.gov.ie/en/department-of-justice-home-affairs-and-migration/press-releases/minister-mcentee-moves-to-reform-vetting-arrangements-and-legislation/ (Accessed: 14 March 2026).</w:t>
+      </w:r>
+    </w:p>
+    <w:p>
+      <w:pPr>
+        <w:pStyle w:val="Bibliography"/>
+      </w:pPr>
+      <w:r>
+        <w:t xml:space="preserve">Department of Rural and Community Development (2021) </w:t>
       </w:r>
       <w:r>
         <w:rPr>
           <w:i/>
           <w:iCs/>
         </w:rPr>
-        <w:t>gov.ie</w:t>
-      </w:r>
-      <w:r>
-        <w:t>. Available at: https://www.gov.ie/en/department-of-rural-and-community-development-and-the-gaeltacht/publications/national-volunteering-strategy-2021-2025/ (Accessed: 9 March 2026).</w:t>
-      </w:r>
-    </w:p>
-    <w:p>
-      <w:pPr>
-        <w:pStyle w:val="Bibliography"/>
-      </w:pPr>
-      <w:r>
-        <w:t xml:space="preserve">National Vetting Bureau (no date) </w:t>
+        <w:t>National Volunteering Strategy (2021 - 2025)</w:t>
+      </w:r>
+      <w:r>
+        <w:t xml:space="preserve">, </w:t>
       </w:r>
       <w:r>
         <w:rPr>
           <w:i/>
           <w:iCs/>
         </w:rPr>
-        <w:t>National Vetting Bureau</w:t>
+        <w:t>gov.ie</w:t>
+      </w:r>
+      <w:r>
+        <w:t>. Available at: https://www.gov.ie/en/department-of-rural-and-community-development-and-the-gaeltacht/publications/national-volunteering-strategy-2021-2025/ (Accessed: 9 March 2026).</w:t>
+      </w:r>
+    </w:p>
+    <w:p>
+      <w:pPr>
+        <w:pStyle w:val="Bibliography"/>
+      </w:pPr>
+      <w:r>
+        <w:t xml:space="preserve">Government of Ireland (2012) </w:t>
+      </w:r>
+      <w:r>
+        <w:rPr>
+          <w:i/>
+          <w:iCs/>
+        </w:rPr>
+        <w:t>Electronic Irish Statute Book (eISB)</w:t>
+      </w:r>
+      <w:r>
+        <w:t xml:space="preserve">, </w:t>
+      </w:r>
+      <w:r>
+        <w:rPr>
+          <w:i/>
+          <w:iCs/>
+        </w:rPr>
+        <w:t>National Vetting Bureau (Children and Vulnerable Persons) Act 2012</w:t>
+      </w:r>
+      <w:r>
+        <w:t>. Office of the Attorney General. Available at: https://www.irishstatutebook.ie/eli/2012/act/47/enacted/en/html (Accessed: 6 March 2026).</w:t>
+      </w:r>
+    </w:p>
+    <w:p>
+      <w:pPr>
+        <w:pStyle w:val="Bibliography"/>
+      </w:pPr>
+      <w:r>
+        <w:t xml:space="preserve">National Vetting Bureau (no date) </w:t>
+      </w:r>
+      <w:r>
+        <w:rPr>
+          <w:i/>
+          <w:iCs/>
+        </w:rPr>
+        <w:t>National Vetting Bureau - About eVetting</w:t>
+      </w:r>
+      <w:r>
+        <w:t xml:space="preserve">, </w:t>
+      </w:r>
+      <w:r>
+        <w:rPr>
+          <w:i/>
+          <w:iCs/>
+        </w:rPr>
+        <w:t>An Garda Síochána</w:t>
       </w:r>
       <w:r>
         <w:t>. Available at: https://vetting.garda.ie/Application/About (Accessed: 7 March 2026).</w:t>
@@ -9550,11 +9241,6 @@
     </w:p>
     <w:p>
       <w:pPr>
-        <w:ind w:left="1701" w:hanging="1701"/>
-      </w:pPr>
-    </w:p>
-    <w:p>
-      <w:pPr>
         <w:spacing w:after="160" w:line="259" w:lineRule="auto"/>
       </w:pPr>
       <w:r>
@@ -9565,7 +9251,7 @@
       <w:pPr>
         <w:pStyle w:val="Heading1"/>
       </w:pPr>
-      <w:bookmarkStart w:id="35" w:name="_Toc224392268"/>
+      <w:bookmarkStart w:id="35" w:name="_Toc224585275"/>
       <w:r>
         <w:lastRenderedPageBreak/>
         <w:t>Appendices</w:t>
@@ -9591,7 +9277,7 @@
       <w:pPr>
         <w:pStyle w:val="Heading1"/>
       </w:pPr>
-      <w:bookmarkStart w:id="36" w:name="_Toc224392269"/>
+      <w:bookmarkStart w:id="36" w:name="_Toc224585276"/>
       <w:r>
         <w:lastRenderedPageBreak/>
         <w:t xml:space="preserve">Appendix </w:t>
@@ -9687,11 +9373,6 @@
       </w:p>
     </w:sdtContent>
   </w:sdt>
-  <w:p>
-    <w:pPr>
-      <w:pStyle w:val="Footer"/>
-    </w:pPr>
-  </w:p>
 </w:ftr>
 </file>
 
@@ -12206,6 +11887,7 @@
   <w:style w:type="character" w:default="1" w:styleId="DefaultParagraphFont">
     <w:name w:val="Default Paragraph Font"/>
     <w:uiPriority w:val="1"/>
+    <w:semiHidden/>
     <w:unhideWhenUsed/>
   </w:style>
   <w:style w:type="table" w:default="1" w:styleId="TableNormal">

</xml_diff>

<commit_message>
chore: UI form consistency and responsive layout improvements
</commit_message>
<xml_diff>
--- a/docs/L00196623-AnnMarieDunne.docx
+++ b/docs/L00196623-AnnMarieDunne.docx
@@ -2462,6 +2462,7 @@
     <w:p>
       <w:pPr>
         <w:pStyle w:val="Heading1"/>
+        <w:spacing w:after="240"/>
       </w:pPr>
       <w:bookmarkStart w:id="5" w:name="_Toc228029035"/>
       <w:r>
@@ -2470,7 +2471,6 @@
       </w:r>
       <w:bookmarkEnd w:id="5"/>
     </w:p>
-    <w:p/>
     <w:sdt>
       <w:sdtPr>
         <w:id w:val="2042621712"/>
@@ -2493,7 +2493,7 @@
             <w:tabs>
               <w:tab w:val="right" w:leader="dot" w:pos="9016"/>
             </w:tabs>
-            <w:spacing w:line="276" w:lineRule="auto"/>
+            <w:spacing w:after="0"/>
             <w:rPr>
               <w:noProof/>
               <w:kern w:val="2"/>
@@ -2575,7 +2575,7 @@
             <w:tabs>
               <w:tab w:val="right" w:leader="dot" w:pos="9016"/>
             </w:tabs>
-            <w:spacing w:line="276" w:lineRule="auto"/>
+            <w:spacing w:after="0"/>
             <w:rPr>
               <w:noProof/>
               <w:kern w:val="2"/>
@@ -2648,7 +2648,7 @@
             <w:tabs>
               <w:tab w:val="right" w:leader="dot" w:pos="9016"/>
             </w:tabs>
-            <w:spacing w:line="276" w:lineRule="auto"/>
+            <w:spacing w:after="0"/>
             <w:rPr>
               <w:noProof/>
               <w:kern w:val="2"/>
@@ -2721,7 +2721,7 @@
             <w:tabs>
               <w:tab w:val="right" w:leader="dot" w:pos="9016"/>
             </w:tabs>
-            <w:spacing w:line="276" w:lineRule="auto"/>
+            <w:spacing w:after="0"/>
             <w:rPr>
               <w:noProof/>
               <w:kern w:val="2"/>
@@ -2794,7 +2794,7 @@
             <w:tabs>
               <w:tab w:val="right" w:leader="dot" w:pos="9016"/>
             </w:tabs>
-            <w:spacing w:line="276" w:lineRule="auto"/>
+            <w:spacing w:after="0"/>
             <w:rPr>
               <w:noProof/>
               <w:kern w:val="2"/>
@@ -2867,7 +2867,7 @@
             <w:tabs>
               <w:tab w:val="right" w:leader="dot" w:pos="9016"/>
             </w:tabs>
-            <w:spacing w:line="276" w:lineRule="auto"/>
+            <w:spacing w:after="0"/>
             <w:rPr>
               <w:noProof/>
               <w:kern w:val="2"/>
@@ -2940,7 +2940,7 @@
             <w:tabs>
               <w:tab w:val="right" w:leader="dot" w:pos="9016"/>
             </w:tabs>
-            <w:spacing w:line="276" w:lineRule="auto"/>
+            <w:spacing w:after="0"/>
             <w:rPr>
               <w:noProof/>
               <w:kern w:val="2"/>
@@ -3013,7 +3013,7 @@
             <w:tabs>
               <w:tab w:val="right" w:leader="dot" w:pos="9016"/>
             </w:tabs>
-            <w:spacing w:line="276" w:lineRule="auto"/>
+            <w:spacing w:after="0"/>
             <w:rPr>
               <w:noProof/>
               <w:kern w:val="2"/>
@@ -3087,7 +3087,7 @@
               <w:tab w:val="left" w:pos="440"/>
               <w:tab w:val="right" w:leader="dot" w:pos="9016"/>
             </w:tabs>
-            <w:spacing w:line="276" w:lineRule="auto"/>
+            <w:spacing w:after="0"/>
             <w:rPr>
               <w:noProof/>
               <w:kern w:val="2"/>
@@ -3174,11 +3174,7 @@
         <w:p>
           <w:pPr>
             <w:pStyle w:val="TOC2"/>
-            <w:tabs>
-              <w:tab w:val="left" w:pos="960"/>
-              <w:tab w:val="right" w:leader="dot" w:pos="9016"/>
-            </w:tabs>
-            <w:spacing w:line="276" w:lineRule="auto"/>
+            <w:spacing w:after="0"/>
             <w:rPr>
               <w:noProof/>
               <w:kern w:val="2"/>
@@ -3265,11 +3261,7 @@
         <w:p>
           <w:pPr>
             <w:pStyle w:val="TOC2"/>
-            <w:tabs>
-              <w:tab w:val="left" w:pos="960"/>
-              <w:tab w:val="right" w:leader="dot" w:pos="9016"/>
-            </w:tabs>
-            <w:spacing w:line="276" w:lineRule="auto"/>
+            <w:spacing w:after="0"/>
             <w:rPr>
               <w:noProof/>
               <w:kern w:val="2"/>
@@ -3356,11 +3348,7 @@
         <w:p>
           <w:pPr>
             <w:pStyle w:val="TOC2"/>
-            <w:tabs>
-              <w:tab w:val="left" w:pos="960"/>
-              <w:tab w:val="right" w:leader="dot" w:pos="9016"/>
-            </w:tabs>
-            <w:spacing w:line="276" w:lineRule="auto"/>
+            <w:spacing w:after="0"/>
             <w:rPr>
               <w:noProof/>
               <w:kern w:val="2"/>
@@ -3447,11 +3435,7 @@
         <w:p>
           <w:pPr>
             <w:pStyle w:val="TOC2"/>
-            <w:tabs>
-              <w:tab w:val="left" w:pos="960"/>
-              <w:tab w:val="right" w:leader="dot" w:pos="9016"/>
-            </w:tabs>
-            <w:spacing w:line="276" w:lineRule="auto"/>
+            <w:spacing w:after="0"/>
             <w:rPr>
               <w:noProof/>
               <w:kern w:val="2"/>
@@ -3542,7 +3526,7 @@
               <w:tab w:val="left" w:pos="1440"/>
               <w:tab w:val="right" w:leader="dot" w:pos="9016"/>
             </w:tabs>
-            <w:spacing w:line="276" w:lineRule="auto"/>
+            <w:spacing w:after="0"/>
             <w:rPr>
               <w:noProof/>
               <w:kern w:val="2"/>
@@ -3633,7 +3617,7 @@
               <w:tab w:val="left" w:pos="1440"/>
               <w:tab w:val="right" w:leader="dot" w:pos="9016"/>
             </w:tabs>
-            <w:spacing w:line="276" w:lineRule="auto"/>
+            <w:spacing w:after="0"/>
             <w:rPr>
               <w:noProof/>
               <w:kern w:val="2"/>
@@ -3724,7 +3708,7 @@
               <w:tab w:val="left" w:pos="1440"/>
               <w:tab w:val="right" w:leader="dot" w:pos="9016"/>
             </w:tabs>
-            <w:spacing w:line="276" w:lineRule="auto"/>
+            <w:spacing w:after="0"/>
             <w:rPr>
               <w:noProof/>
               <w:kern w:val="2"/>
@@ -3815,7 +3799,7 @@
               <w:tab w:val="left" w:pos="1440"/>
               <w:tab w:val="right" w:leader="dot" w:pos="9016"/>
             </w:tabs>
-            <w:spacing w:line="276" w:lineRule="auto"/>
+            <w:spacing w:after="0"/>
             <w:rPr>
               <w:noProof/>
               <w:kern w:val="2"/>
@@ -3906,7 +3890,7 @@
               <w:tab w:val="left" w:pos="440"/>
               <w:tab w:val="right" w:leader="dot" w:pos="9016"/>
             </w:tabs>
-            <w:spacing w:line="276" w:lineRule="auto"/>
+            <w:spacing w:after="0"/>
             <w:rPr>
               <w:noProof/>
               <w:kern w:val="2"/>
@@ -3993,11 +3977,7 @@
         <w:p>
           <w:pPr>
             <w:pStyle w:val="TOC2"/>
-            <w:tabs>
-              <w:tab w:val="left" w:pos="960"/>
-              <w:tab w:val="right" w:leader="dot" w:pos="9016"/>
-            </w:tabs>
-            <w:spacing w:line="276" w:lineRule="auto"/>
+            <w:spacing w:after="0"/>
             <w:rPr>
               <w:noProof/>
               <w:kern w:val="2"/>
@@ -4084,11 +4064,7 @@
         <w:p>
           <w:pPr>
             <w:pStyle w:val="TOC2"/>
-            <w:tabs>
-              <w:tab w:val="left" w:pos="960"/>
-              <w:tab w:val="right" w:leader="dot" w:pos="9016"/>
-            </w:tabs>
-            <w:spacing w:line="276" w:lineRule="auto"/>
+            <w:spacing w:after="0"/>
             <w:rPr>
               <w:noProof/>
               <w:kern w:val="2"/>
@@ -4179,7 +4155,7 @@
               <w:tab w:val="left" w:pos="1440"/>
               <w:tab w:val="right" w:leader="dot" w:pos="9016"/>
             </w:tabs>
-            <w:spacing w:line="276" w:lineRule="auto"/>
+            <w:spacing w:after="0"/>
             <w:rPr>
               <w:noProof/>
               <w:kern w:val="2"/>
@@ -4270,7 +4246,7 @@
               <w:tab w:val="left" w:pos="1440"/>
               <w:tab w:val="right" w:leader="dot" w:pos="9016"/>
             </w:tabs>
-            <w:spacing w:line="276" w:lineRule="auto"/>
+            <w:spacing w:after="0"/>
             <w:rPr>
               <w:noProof/>
               <w:kern w:val="2"/>
@@ -4361,7 +4337,7 @@
               <w:tab w:val="left" w:pos="1440"/>
               <w:tab w:val="right" w:leader="dot" w:pos="9016"/>
             </w:tabs>
-            <w:spacing w:line="276" w:lineRule="auto"/>
+            <w:spacing w:after="0"/>
             <w:rPr>
               <w:noProof/>
               <w:kern w:val="2"/>
@@ -4452,7 +4428,7 @@
               <w:tab w:val="left" w:pos="1440"/>
               <w:tab w:val="right" w:leader="dot" w:pos="9016"/>
             </w:tabs>
-            <w:spacing w:line="276" w:lineRule="auto"/>
+            <w:spacing w:after="0"/>
             <w:rPr>
               <w:noProof/>
               <w:kern w:val="2"/>
@@ -4543,7 +4519,7 @@
               <w:tab w:val="left" w:pos="1440"/>
               <w:tab w:val="right" w:leader="dot" w:pos="9016"/>
             </w:tabs>
-            <w:spacing w:line="276" w:lineRule="auto"/>
+            <w:spacing w:after="0"/>
             <w:rPr>
               <w:noProof/>
               <w:kern w:val="2"/>
@@ -4630,11 +4606,7 @@
         <w:p>
           <w:pPr>
             <w:pStyle w:val="TOC2"/>
-            <w:tabs>
-              <w:tab w:val="left" w:pos="960"/>
-              <w:tab w:val="right" w:leader="dot" w:pos="9016"/>
-            </w:tabs>
-            <w:spacing w:line="276" w:lineRule="auto"/>
+            <w:spacing w:after="0"/>
             <w:rPr>
               <w:noProof/>
               <w:kern w:val="2"/>
@@ -4725,7 +4697,7 @@
               <w:tab w:val="left" w:pos="1440"/>
               <w:tab w:val="right" w:leader="dot" w:pos="9016"/>
             </w:tabs>
-            <w:spacing w:line="276" w:lineRule="auto"/>
+            <w:spacing w:after="0"/>
             <w:rPr>
               <w:noProof/>
               <w:kern w:val="2"/>
@@ -4816,7 +4788,7 @@
               <w:tab w:val="left" w:pos="1440"/>
               <w:tab w:val="right" w:leader="dot" w:pos="9016"/>
             </w:tabs>
-            <w:spacing w:line="276" w:lineRule="auto"/>
+            <w:spacing w:after="0"/>
             <w:rPr>
               <w:noProof/>
               <w:kern w:val="2"/>
@@ -4907,7 +4879,7 @@
               <w:tab w:val="left" w:pos="1440"/>
               <w:tab w:val="right" w:leader="dot" w:pos="9016"/>
             </w:tabs>
-            <w:spacing w:line="276" w:lineRule="auto"/>
+            <w:spacing w:after="0"/>
             <w:rPr>
               <w:noProof/>
               <w:kern w:val="2"/>
@@ -4998,7 +4970,7 @@
               <w:tab w:val="left" w:pos="1440"/>
               <w:tab w:val="right" w:leader="dot" w:pos="9016"/>
             </w:tabs>
-            <w:spacing w:line="276" w:lineRule="auto"/>
+            <w:spacing w:after="0"/>
             <w:rPr>
               <w:noProof/>
               <w:kern w:val="2"/>
@@ -5089,7 +5061,7 @@
               <w:tab w:val="left" w:pos="1440"/>
               <w:tab w:val="right" w:leader="dot" w:pos="9016"/>
             </w:tabs>
-            <w:spacing w:line="276" w:lineRule="auto"/>
+            <w:spacing w:after="0"/>
             <w:rPr>
               <w:noProof/>
               <w:kern w:val="2"/>
@@ -5176,11 +5148,7 @@
         <w:p>
           <w:pPr>
             <w:pStyle w:val="TOC2"/>
-            <w:tabs>
-              <w:tab w:val="left" w:pos="960"/>
-              <w:tab w:val="right" w:leader="dot" w:pos="9016"/>
-            </w:tabs>
-            <w:spacing w:line="276" w:lineRule="auto"/>
+            <w:spacing w:after="0"/>
             <w:rPr>
               <w:noProof/>
               <w:kern w:val="2"/>
@@ -5267,11 +5235,7 @@
         <w:p>
           <w:pPr>
             <w:pStyle w:val="TOC2"/>
-            <w:tabs>
-              <w:tab w:val="left" w:pos="960"/>
-              <w:tab w:val="right" w:leader="dot" w:pos="9016"/>
-            </w:tabs>
-            <w:spacing w:line="276" w:lineRule="auto"/>
+            <w:spacing w:after="0"/>
             <w:rPr>
               <w:noProof/>
               <w:kern w:val="2"/>
@@ -5358,11 +5322,7 @@
         <w:p>
           <w:pPr>
             <w:pStyle w:val="TOC2"/>
-            <w:tabs>
-              <w:tab w:val="left" w:pos="960"/>
-              <w:tab w:val="right" w:leader="dot" w:pos="9016"/>
-            </w:tabs>
-            <w:spacing w:line="276" w:lineRule="auto"/>
+            <w:spacing w:after="0"/>
             <w:rPr>
               <w:noProof/>
               <w:kern w:val="2"/>
@@ -5453,7 +5413,7 @@
               <w:tab w:val="left" w:pos="440"/>
               <w:tab w:val="right" w:leader="dot" w:pos="9016"/>
             </w:tabs>
-            <w:spacing w:line="276" w:lineRule="auto"/>
+            <w:spacing w:after="0"/>
             <w:rPr>
               <w:noProof/>
               <w:kern w:val="2"/>
@@ -5540,11 +5500,7 @@
         <w:p>
           <w:pPr>
             <w:pStyle w:val="TOC2"/>
-            <w:tabs>
-              <w:tab w:val="left" w:pos="960"/>
-              <w:tab w:val="right" w:leader="dot" w:pos="9016"/>
-            </w:tabs>
-            <w:spacing w:line="276" w:lineRule="auto"/>
+            <w:spacing w:after="0"/>
             <w:rPr>
               <w:noProof/>
               <w:kern w:val="2"/>
@@ -5635,7 +5591,7 @@
               <w:tab w:val="left" w:pos="1440"/>
               <w:tab w:val="right" w:leader="dot" w:pos="9016"/>
             </w:tabs>
-            <w:spacing w:line="276" w:lineRule="auto"/>
+            <w:spacing w:after="0"/>
             <w:rPr>
               <w:noProof/>
               <w:kern w:val="2"/>
@@ -5726,7 +5682,7 @@
               <w:tab w:val="left" w:pos="1440"/>
               <w:tab w:val="right" w:leader="dot" w:pos="9016"/>
             </w:tabs>
-            <w:spacing w:line="276" w:lineRule="auto"/>
+            <w:spacing w:after="0"/>
             <w:rPr>
               <w:noProof/>
               <w:kern w:val="2"/>
@@ -5817,7 +5773,7 @@
               <w:tab w:val="left" w:pos="1440"/>
               <w:tab w:val="right" w:leader="dot" w:pos="9016"/>
             </w:tabs>
-            <w:spacing w:line="276" w:lineRule="auto"/>
+            <w:spacing w:after="0"/>
             <w:rPr>
               <w:noProof/>
               <w:kern w:val="2"/>
@@ -5890,7 +5846,7 @@
                 <w:noProof/>
                 <w:webHidden/>
               </w:rPr>
-              <w:t>49</w:t>
+              <w:t>48</w:t>
             </w:r>
             <w:r>
               <w:rPr>
@@ -5904,11 +5860,7 @@
         <w:p>
           <w:pPr>
             <w:pStyle w:val="TOC2"/>
-            <w:tabs>
-              <w:tab w:val="left" w:pos="960"/>
-              <w:tab w:val="right" w:leader="dot" w:pos="9016"/>
-            </w:tabs>
-            <w:spacing w:line="276" w:lineRule="auto"/>
+            <w:spacing w:after="0"/>
             <w:rPr>
               <w:noProof/>
               <w:kern w:val="2"/>
@@ -5999,7 +5951,7 @@
               <w:tab w:val="left" w:pos="1440"/>
               <w:tab w:val="right" w:leader="dot" w:pos="9016"/>
             </w:tabs>
-            <w:spacing w:line="276" w:lineRule="auto"/>
+            <w:spacing w:after="0"/>
             <w:rPr>
               <w:noProof/>
               <w:kern w:val="2"/>
@@ -6072,7 +6024,7 @@
                 <w:noProof/>
                 <w:webHidden/>
               </w:rPr>
-              <w:t>50</w:t>
+              <w:t>49</w:t>
             </w:r>
             <w:r>
               <w:rPr>
@@ -6090,7 +6042,7 @@
               <w:tab w:val="left" w:pos="1440"/>
               <w:tab w:val="right" w:leader="dot" w:pos="9016"/>
             </w:tabs>
-            <w:spacing w:line="276" w:lineRule="auto"/>
+            <w:spacing w:after="0"/>
             <w:rPr>
               <w:noProof/>
               <w:kern w:val="2"/>
@@ -6177,11 +6129,7 @@
         <w:p>
           <w:pPr>
             <w:pStyle w:val="TOC2"/>
-            <w:tabs>
-              <w:tab w:val="left" w:pos="960"/>
-              <w:tab w:val="right" w:leader="dot" w:pos="9016"/>
-            </w:tabs>
-            <w:spacing w:line="276" w:lineRule="auto"/>
+            <w:spacing w:after="0"/>
             <w:rPr>
               <w:noProof/>
               <w:kern w:val="2"/>
@@ -6268,11 +6216,7 @@
         <w:p>
           <w:pPr>
             <w:pStyle w:val="TOC2"/>
-            <w:tabs>
-              <w:tab w:val="left" w:pos="960"/>
-              <w:tab w:val="right" w:leader="dot" w:pos="9016"/>
-            </w:tabs>
-            <w:spacing w:line="276" w:lineRule="auto"/>
+            <w:spacing w:after="0"/>
             <w:rPr>
               <w:noProof/>
               <w:kern w:val="2"/>
@@ -6363,7 +6307,7 @@
               <w:tab w:val="left" w:pos="1440"/>
               <w:tab w:val="right" w:leader="dot" w:pos="9016"/>
             </w:tabs>
-            <w:spacing w:line="276" w:lineRule="auto"/>
+            <w:spacing w:after="0"/>
             <w:rPr>
               <w:noProof/>
               <w:kern w:val="2"/>
@@ -6454,7 +6398,7 @@
               <w:tab w:val="left" w:pos="1440"/>
               <w:tab w:val="right" w:leader="dot" w:pos="9016"/>
             </w:tabs>
-            <w:spacing w:line="276" w:lineRule="auto"/>
+            <w:spacing w:after="0"/>
             <w:rPr>
               <w:noProof/>
               <w:kern w:val="2"/>
@@ -6541,11 +6485,7 @@
         <w:p>
           <w:pPr>
             <w:pStyle w:val="TOC2"/>
-            <w:tabs>
-              <w:tab w:val="left" w:pos="960"/>
-              <w:tab w:val="right" w:leader="dot" w:pos="9016"/>
-            </w:tabs>
-            <w:spacing w:line="276" w:lineRule="auto"/>
+            <w:spacing w:after="0"/>
             <w:rPr>
               <w:noProof/>
               <w:kern w:val="2"/>
@@ -6632,11 +6572,7 @@
         <w:p>
           <w:pPr>
             <w:pStyle w:val="TOC2"/>
-            <w:tabs>
-              <w:tab w:val="left" w:pos="960"/>
-              <w:tab w:val="right" w:leader="dot" w:pos="9016"/>
-            </w:tabs>
-            <w:spacing w:line="276" w:lineRule="auto"/>
+            <w:spacing w:after="0"/>
             <w:rPr>
               <w:noProof/>
               <w:kern w:val="2"/>
@@ -6727,7 +6663,7 @@
               <w:tab w:val="left" w:pos="1440"/>
               <w:tab w:val="right" w:leader="dot" w:pos="9016"/>
             </w:tabs>
-            <w:spacing w:line="276" w:lineRule="auto"/>
+            <w:spacing w:after="0"/>
             <w:rPr>
               <w:noProof/>
               <w:kern w:val="2"/>
@@ -6818,7 +6754,7 @@
               <w:tab w:val="left" w:pos="1440"/>
               <w:tab w:val="right" w:leader="dot" w:pos="9016"/>
             </w:tabs>
-            <w:spacing w:line="276" w:lineRule="auto"/>
+            <w:spacing w:after="0"/>
             <w:rPr>
               <w:noProof/>
               <w:kern w:val="2"/>
@@ -6909,7 +6845,7 @@
               <w:tab w:val="left" w:pos="1440"/>
               <w:tab w:val="right" w:leader="dot" w:pos="9016"/>
             </w:tabs>
-            <w:spacing w:line="276" w:lineRule="auto"/>
+            <w:spacing w:after="0"/>
             <w:rPr>
               <w:noProof/>
               <w:kern w:val="2"/>
@@ -6996,11 +6932,7 @@
         <w:p>
           <w:pPr>
             <w:pStyle w:val="TOC2"/>
-            <w:tabs>
-              <w:tab w:val="left" w:pos="960"/>
-              <w:tab w:val="right" w:leader="dot" w:pos="9016"/>
-            </w:tabs>
-            <w:spacing w:line="276" w:lineRule="auto"/>
+            <w:spacing w:after="0"/>
             <w:rPr>
               <w:noProof/>
               <w:kern w:val="2"/>
@@ -7091,7 +7023,7 @@
               <w:tab w:val="left" w:pos="1440"/>
               <w:tab w:val="right" w:leader="dot" w:pos="9016"/>
             </w:tabs>
-            <w:spacing w:line="276" w:lineRule="auto"/>
+            <w:spacing w:after="0"/>
             <w:rPr>
               <w:noProof/>
               <w:kern w:val="2"/>
@@ -7182,7 +7114,7 @@
               <w:tab w:val="left" w:pos="1440"/>
               <w:tab w:val="right" w:leader="dot" w:pos="9016"/>
             </w:tabs>
-            <w:spacing w:line="276" w:lineRule="auto"/>
+            <w:spacing w:after="0"/>
             <w:rPr>
               <w:noProof/>
               <w:kern w:val="2"/>
@@ -7273,7 +7205,7 @@
               <w:tab w:val="left" w:pos="1440"/>
               <w:tab w:val="right" w:leader="dot" w:pos="9016"/>
             </w:tabs>
-            <w:spacing w:line="276" w:lineRule="auto"/>
+            <w:spacing w:after="0"/>
             <w:rPr>
               <w:noProof/>
               <w:kern w:val="2"/>
@@ -7364,7 +7296,7 @@
               <w:tab w:val="left" w:pos="1440"/>
               <w:tab w:val="right" w:leader="dot" w:pos="9016"/>
             </w:tabs>
-            <w:spacing w:line="276" w:lineRule="auto"/>
+            <w:spacing w:after="0"/>
             <w:rPr>
               <w:noProof/>
               <w:kern w:val="2"/>
@@ -7455,7 +7387,7 @@
               <w:tab w:val="left" w:pos="1440"/>
               <w:tab w:val="right" w:leader="dot" w:pos="9016"/>
             </w:tabs>
-            <w:spacing w:line="276" w:lineRule="auto"/>
+            <w:spacing w:after="0"/>
             <w:rPr>
               <w:noProof/>
               <w:kern w:val="2"/>
@@ -7546,7 +7478,7 @@
               <w:tab w:val="left" w:pos="1440"/>
               <w:tab w:val="right" w:leader="dot" w:pos="9016"/>
             </w:tabs>
-            <w:spacing w:line="276" w:lineRule="auto"/>
+            <w:spacing w:after="0"/>
             <w:rPr>
               <w:noProof/>
               <w:kern w:val="2"/>
@@ -7637,7 +7569,7 @@
               <w:tab w:val="left" w:pos="1440"/>
               <w:tab w:val="right" w:leader="dot" w:pos="9016"/>
             </w:tabs>
-            <w:spacing w:line="276" w:lineRule="auto"/>
+            <w:spacing w:after="0"/>
             <w:rPr>
               <w:noProof/>
               <w:kern w:val="2"/>
@@ -7724,11 +7656,7 @@
         <w:p>
           <w:pPr>
             <w:pStyle w:val="TOC2"/>
-            <w:tabs>
-              <w:tab w:val="left" w:pos="960"/>
-              <w:tab w:val="right" w:leader="dot" w:pos="9016"/>
-            </w:tabs>
-            <w:spacing w:line="276" w:lineRule="auto"/>
+            <w:spacing w:after="0"/>
             <w:rPr>
               <w:noProof/>
               <w:kern w:val="2"/>
@@ -7819,7 +7747,7 @@
               <w:tab w:val="left" w:pos="1440"/>
               <w:tab w:val="right" w:leader="dot" w:pos="9016"/>
             </w:tabs>
-            <w:spacing w:line="276" w:lineRule="auto"/>
+            <w:spacing w:after="0"/>
             <w:rPr>
               <w:noProof/>
               <w:kern w:val="2"/>
@@ -7910,7 +7838,7 @@
               <w:tab w:val="left" w:pos="1440"/>
               <w:tab w:val="right" w:leader="dot" w:pos="9016"/>
             </w:tabs>
-            <w:spacing w:line="276" w:lineRule="auto"/>
+            <w:spacing w:after="0"/>
             <w:rPr>
               <w:noProof/>
               <w:kern w:val="2"/>
@@ -8001,7 +7929,7 @@
               <w:tab w:val="left" w:pos="1440"/>
               <w:tab w:val="right" w:leader="dot" w:pos="9016"/>
             </w:tabs>
-            <w:spacing w:line="276" w:lineRule="auto"/>
+            <w:spacing w:after="0"/>
             <w:rPr>
               <w:noProof/>
               <w:kern w:val="2"/>
@@ -8088,11 +8016,7 @@
         <w:p>
           <w:pPr>
             <w:pStyle w:val="TOC2"/>
-            <w:tabs>
-              <w:tab w:val="left" w:pos="960"/>
-              <w:tab w:val="right" w:leader="dot" w:pos="9016"/>
-            </w:tabs>
-            <w:spacing w:line="276" w:lineRule="auto"/>
+            <w:spacing w:after="0"/>
             <w:rPr>
               <w:noProof/>
               <w:kern w:val="2"/>
@@ -8183,7 +8107,7 @@
               <w:tab w:val="left" w:pos="440"/>
               <w:tab w:val="right" w:leader="dot" w:pos="9016"/>
             </w:tabs>
-            <w:spacing w:line="276" w:lineRule="auto"/>
+            <w:spacing w:after="0"/>
             <w:rPr>
               <w:noProof/>
               <w:kern w:val="2"/>
@@ -8274,7 +8198,7 @@
               <w:tab w:val="left" w:pos="440"/>
               <w:tab w:val="right" w:leader="dot" w:pos="9016"/>
             </w:tabs>
-            <w:spacing w:line="276" w:lineRule="auto"/>
+            <w:spacing w:after="0"/>
             <w:rPr>
               <w:noProof/>
               <w:kern w:val="2"/>
@@ -8361,11 +8285,7 @@
         <w:p>
           <w:pPr>
             <w:pStyle w:val="TOC2"/>
-            <w:tabs>
-              <w:tab w:val="left" w:pos="960"/>
-              <w:tab w:val="right" w:leader="dot" w:pos="9016"/>
-            </w:tabs>
-            <w:spacing w:line="276" w:lineRule="auto"/>
+            <w:spacing w:after="0"/>
             <w:rPr>
               <w:noProof/>
               <w:kern w:val="2"/>
@@ -8452,11 +8372,7 @@
         <w:p>
           <w:pPr>
             <w:pStyle w:val="TOC2"/>
-            <w:tabs>
-              <w:tab w:val="left" w:pos="960"/>
-              <w:tab w:val="right" w:leader="dot" w:pos="9016"/>
-            </w:tabs>
-            <w:spacing w:line="276" w:lineRule="auto"/>
+            <w:spacing w:after="0"/>
             <w:rPr>
               <w:noProof/>
               <w:kern w:val="2"/>
@@ -8543,11 +8459,7 @@
         <w:p>
           <w:pPr>
             <w:pStyle w:val="TOC2"/>
-            <w:tabs>
-              <w:tab w:val="left" w:pos="960"/>
-              <w:tab w:val="right" w:leader="dot" w:pos="9016"/>
-            </w:tabs>
-            <w:spacing w:line="276" w:lineRule="auto"/>
+            <w:spacing w:after="0"/>
             <w:rPr>
               <w:noProof/>
               <w:kern w:val="2"/>
@@ -8634,11 +8546,7 @@
         <w:p>
           <w:pPr>
             <w:pStyle w:val="TOC2"/>
-            <w:tabs>
-              <w:tab w:val="left" w:pos="960"/>
-              <w:tab w:val="right" w:leader="dot" w:pos="9016"/>
-            </w:tabs>
-            <w:spacing w:line="276" w:lineRule="auto"/>
+            <w:spacing w:after="0"/>
             <w:rPr>
               <w:noProof/>
               <w:kern w:val="2"/>
@@ -8728,7 +8636,7 @@
             <w:tabs>
               <w:tab w:val="right" w:leader="dot" w:pos="9016"/>
             </w:tabs>
-            <w:spacing w:line="276" w:lineRule="auto"/>
+            <w:spacing w:after="0"/>
             <w:rPr>
               <w:noProof/>
               <w:kern w:val="2"/>
@@ -8801,7 +8709,7 @@
             <w:tabs>
               <w:tab w:val="right" w:leader="dot" w:pos="9016"/>
             </w:tabs>
-            <w:spacing w:line="276" w:lineRule="auto"/>
+            <w:spacing w:after="0"/>
             <w:rPr>
               <w:noProof/>
               <w:kern w:val="2"/>
@@ -8874,7 +8782,7 @@
             <w:tabs>
               <w:tab w:val="right" w:leader="dot" w:pos="9016"/>
             </w:tabs>
-            <w:spacing w:line="276" w:lineRule="auto"/>
+            <w:spacing w:after="0"/>
             <w:rPr>
               <w:noProof/>
               <w:kern w:val="2"/>
@@ -22880,7 +22788,7 @@
         </w:rPr>
         <w:lastRenderedPageBreak/>
         <w:drawing>
-          <wp:inline distT="0" distB="0" distL="0" distR="0" wp14:anchorId="4BC505CF" wp14:editId="3C6CA10B">
+          <wp:inline distT="0" distB="0" distL="0" distR="0" wp14:anchorId="4BC505CF" wp14:editId="222AC058">
             <wp:extent cx="5905500" cy="2565418"/>
             <wp:effectExtent l="0" t="0" r="0" b="6350"/>
             <wp:docPr id="313767233" name="Picture 1"/>
@@ -36462,9 +36370,9 @@
           <w:noProof/>
         </w:rPr>
         <w:drawing>
-          <wp:inline distT="0" distB="0" distL="0" distR="0" wp14:anchorId="662E77C5" wp14:editId="6B37CA7B">
-            <wp:extent cx="3676190" cy="3647619"/>
-            <wp:effectExtent l="19050" t="19050" r="19685" b="10160"/>
+          <wp:inline distT="0" distB="0" distL="0" distR="0" wp14:anchorId="662E77C5" wp14:editId="3FFEF747">
+            <wp:extent cx="3676190" cy="3582409"/>
+            <wp:effectExtent l="19050" t="19050" r="19685" b="18415"/>
             <wp:docPr id="250806153" name="Picture 2"/>
             <wp:cNvGraphicFramePr>
               <a:graphicFrameLocks xmlns:a="http://schemas.openxmlformats.org/drawingml/2006/main" noChangeAspect="1"/>
@@ -36473,7 +36381,7 @@
               <a:graphicData uri="http://schemas.openxmlformats.org/drawingml/2006/picture">
                 <pic:pic xmlns:pic="http://schemas.openxmlformats.org/drawingml/2006/picture">
                   <pic:nvPicPr>
-                    <pic:cNvPr id="250806153" name="Picture 250806153"/>
+                    <pic:cNvPr id="250806153" name="Picture 2"/>
                     <pic:cNvPicPr/>
                   </pic:nvPicPr>
                   <pic:blipFill>
@@ -36491,7 +36399,7 @@
                   <pic:spPr>
                     <a:xfrm>
                       <a:off x="0" y="0"/>
-                      <a:ext cx="3676190" cy="3647619"/>
+                      <a:ext cx="3676190" cy="3582409"/>
                     </a:xfrm>
                     <a:prstGeom prst="rect">
                       <a:avLst/>
@@ -36567,9 +36475,9 @@
           <w:noProof/>
         </w:rPr>
         <w:drawing>
-          <wp:inline distT="0" distB="0" distL="0" distR="0" wp14:anchorId="5925DD78" wp14:editId="4F286EF5">
-            <wp:extent cx="5731510" cy="4018280"/>
-            <wp:effectExtent l="19050" t="19050" r="21590" b="20320"/>
+          <wp:inline distT="0" distB="0" distL="0" distR="0" wp14:anchorId="5925DD78" wp14:editId="080FFD0A">
+            <wp:extent cx="5668169" cy="4008539"/>
+            <wp:effectExtent l="19050" t="19050" r="27940" b="11430"/>
             <wp:docPr id="475555436" name="Picture 2"/>
             <wp:cNvGraphicFramePr>
               <a:graphicFrameLocks xmlns:a="http://schemas.openxmlformats.org/drawingml/2006/main" noChangeAspect="1"/>
@@ -36578,7 +36486,7 @@
               <a:graphicData uri="http://schemas.openxmlformats.org/drawingml/2006/picture">
                 <pic:pic xmlns:pic="http://schemas.openxmlformats.org/drawingml/2006/picture">
                   <pic:nvPicPr>
-                    <pic:cNvPr id="475555436" name="Picture 475555436"/>
+                    <pic:cNvPr id="475555436" name="Picture 2"/>
                     <pic:cNvPicPr/>
                   </pic:nvPicPr>
                   <pic:blipFill>
@@ -36596,7 +36504,7 @@
                   <pic:spPr>
                     <a:xfrm>
                       <a:off x="0" y="0"/>
-                      <a:ext cx="5731510" cy="4018280"/>
+                      <a:ext cx="5668169" cy="4008539"/>
                     </a:xfrm>
                     <a:prstGeom prst="rect">
                       <a:avLst/>
@@ -36660,9 +36568,9 @@
           <w:noProof/>
         </w:rPr>
         <w:drawing>
-          <wp:inline distT="0" distB="0" distL="0" distR="0" wp14:anchorId="0D9FEB0F" wp14:editId="3595DCB8">
-            <wp:extent cx="5731510" cy="3286760"/>
-            <wp:effectExtent l="19050" t="19050" r="21590" b="27940"/>
+          <wp:inline distT="0" distB="0" distL="0" distR="0" wp14:anchorId="0D9FEB0F" wp14:editId="33BCDEAE">
+            <wp:extent cx="5497154" cy="3286760"/>
+            <wp:effectExtent l="19050" t="19050" r="27940" b="27940"/>
             <wp:docPr id="1309412614" name="Picture 3"/>
             <wp:cNvGraphicFramePr>
               <a:graphicFrameLocks xmlns:a="http://schemas.openxmlformats.org/drawingml/2006/main" noChangeAspect="1"/>
@@ -36671,7 +36579,7 @@
               <a:graphicData uri="http://schemas.openxmlformats.org/drawingml/2006/picture">
                 <pic:pic xmlns:pic="http://schemas.openxmlformats.org/drawingml/2006/picture">
                   <pic:nvPicPr>
-                    <pic:cNvPr id="1309412614" name="Picture 1309412614"/>
+                    <pic:cNvPr id="1309412614" name="Picture 3"/>
                     <pic:cNvPicPr/>
                   </pic:nvPicPr>
                   <pic:blipFill>
@@ -36689,7 +36597,7 @@
                   <pic:spPr>
                     <a:xfrm>
                       <a:off x="0" y="0"/>
-                      <a:ext cx="5731510" cy="3286760"/>
+                      <a:ext cx="5497154" cy="3286760"/>
                     </a:xfrm>
                     <a:prstGeom prst="rect">
                       <a:avLst/>
@@ -36743,20 +36651,15 @@
       </w:r>
     </w:p>
     <w:p>
-      <w:pPr>
-        <w:keepNext/>
-        <w:spacing w:after="0"/>
-        <w:jc w:val="left"/>
-      </w:pPr>
       <w:r>
         <w:rPr>
           <w:noProof/>
         </w:rPr>
         <w:drawing>
-          <wp:inline distT="0" distB="0" distL="0" distR="0" wp14:anchorId="1F88DA66" wp14:editId="0CBFBD93">
-            <wp:extent cx="5731510" cy="1819275"/>
-            <wp:effectExtent l="19050" t="19050" r="21590" b="28575"/>
-            <wp:docPr id="381839696" name="Picture 4"/>
+          <wp:inline distT="0" distB="0" distL="0" distR="0" wp14:anchorId="25484522" wp14:editId="288A15A5">
+            <wp:extent cx="5731510" cy="1809115"/>
+            <wp:effectExtent l="19050" t="19050" r="21590" b="19685"/>
+            <wp:docPr id="368134269" name="Picture 1"/>
             <wp:cNvGraphicFramePr>
               <a:graphicFrameLocks xmlns:a="http://schemas.openxmlformats.org/drawingml/2006/main" noChangeAspect="1"/>
             </wp:cNvGraphicFramePr>
@@ -36764,7 +36667,7 @@
               <a:graphicData uri="http://schemas.openxmlformats.org/drawingml/2006/picture">
                 <pic:pic xmlns:pic="http://schemas.openxmlformats.org/drawingml/2006/picture">
                   <pic:nvPicPr>
-                    <pic:cNvPr id="381839696" name="Picture 381839696"/>
+                    <pic:cNvPr id="368134269" name="Picture 368134269"/>
                     <pic:cNvPicPr/>
                   </pic:nvPicPr>
                   <pic:blipFill>
@@ -36782,7 +36685,7 @@
                   <pic:spPr>
                     <a:xfrm>
                       <a:off x="0" y="0"/>
-                      <a:ext cx="5731510" cy="1819275"/>
+                      <a:ext cx="5731510" cy="1809115"/>
                     </a:xfrm>
                     <a:prstGeom prst="rect">
                       <a:avLst/>
@@ -37050,9 +36953,9 @@
           <w:noProof/>
         </w:rPr>
         <w:drawing>
-          <wp:inline distT="0" distB="0" distL="0" distR="0" wp14:anchorId="4FB5A980" wp14:editId="78024147">
-            <wp:extent cx="5986244" cy="4476750"/>
-            <wp:effectExtent l="19050" t="19050" r="14605" b="19050"/>
+          <wp:inline distT="0" distB="0" distL="0" distR="0" wp14:anchorId="4FB5A980" wp14:editId="6CC66D93">
+            <wp:extent cx="4552950" cy="4833408"/>
+            <wp:effectExtent l="19050" t="19050" r="19050" b="24765"/>
             <wp:docPr id="1777384667" name="Picture 2"/>
             <wp:cNvGraphicFramePr>
               <a:graphicFrameLocks xmlns:a="http://schemas.openxmlformats.org/drawingml/2006/main" noChangeAspect="1"/>
@@ -37061,7 +36964,7 @@
               <a:graphicData uri="http://schemas.openxmlformats.org/drawingml/2006/picture">
                 <pic:pic xmlns:pic="http://schemas.openxmlformats.org/drawingml/2006/picture">
                   <pic:nvPicPr>
-                    <pic:cNvPr id="1777384667" name="Picture 1777384667"/>
+                    <pic:cNvPr id="1777384667" name="Picture 2"/>
                     <pic:cNvPicPr/>
                   </pic:nvPicPr>
                   <pic:blipFill>
@@ -37079,7 +36982,7 @@
                   <pic:spPr>
                     <a:xfrm>
                       <a:off x="0" y="0"/>
-                      <a:ext cx="5989984" cy="4479547"/>
+                      <a:ext cx="4561209" cy="4842176"/>
                     </a:xfrm>
                     <a:prstGeom prst="rect">
                       <a:avLst/>
@@ -41084,9 +40987,9 @@
           <w:noProof/>
         </w:rPr>
         <w:drawing>
-          <wp:inline distT="0" distB="0" distL="0" distR="0" wp14:anchorId="21B20C6B" wp14:editId="3DE51429">
-            <wp:extent cx="5731510" cy="3495675"/>
-            <wp:effectExtent l="19050" t="19050" r="21590" b="28575"/>
+          <wp:inline distT="0" distB="0" distL="0" distR="0" wp14:anchorId="21B20C6B" wp14:editId="0C673231">
+            <wp:extent cx="4235239" cy="3495675"/>
+            <wp:effectExtent l="19050" t="19050" r="13335" b="9525"/>
             <wp:docPr id="1075686873" name="Picture 1"/>
             <wp:cNvGraphicFramePr>
               <a:graphicFrameLocks xmlns:a="http://schemas.openxmlformats.org/drawingml/2006/main" noChangeAspect="1"/>
@@ -41095,7 +40998,7 @@
               <a:graphicData uri="http://schemas.openxmlformats.org/drawingml/2006/picture">
                 <pic:pic xmlns:pic="http://schemas.openxmlformats.org/drawingml/2006/picture">
                   <pic:nvPicPr>
-                    <pic:cNvPr id="1075686873" name="Picture 1075686873"/>
+                    <pic:cNvPr id="1075686873" name="Picture 1"/>
                     <pic:cNvPicPr/>
                   </pic:nvPicPr>
                   <pic:blipFill>
@@ -41113,7 +41016,7 @@
                   <pic:spPr>
                     <a:xfrm>
                       <a:off x="0" y="0"/>
-                      <a:ext cx="5731510" cy="3495675"/>
+                      <a:ext cx="4235239" cy="3495675"/>
                     </a:xfrm>
                     <a:prstGeom prst="rect">
                       <a:avLst/>
@@ -43098,7 +43001,21 @@
         <w:rPr>
           <w:rFonts w:ascii="Calibri" w:hAnsi="Calibri" w:cs="Calibri"/>
         </w:rPr>
-        <w:t>(Ziąbek, 2026)</w:t>
+        <w:t>(</w:t>
+      </w:r>
+      <w:proofErr w:type="spellStart"/>
+      <w:r>
+        <w:rPr>
+          <w:rFonts w:ascii="Calibri" w:hAnsi="Calibri" w:cs="Calibri"/>
+        </w:rPr>
+        <w:t>Ziąbek</w:t>
+      </w:r>
+      <w:proofErr w:type="spellEnd"/>
+      <w:r>
+        <w:rPr>
+          <w:rFonts w:ascii="Calibri" w:hAnsi="Calibri" w:cs="Calibri"/>
+        </w:rPr>
+        <w:t>, 2026)</w:t>
       </w:r>
       <w:r>
         <w:fldChar w:fldCharType="end"/>
@@ -47916,13 +47833,8 @@
       <w:r>
         <w:fldChar w:fldCharType="separate"/>
       </w:r>
-      <w:proofErr w:type="gramStart"/>
-      <w:r>
-        <w:t>An</w:t>
-      </w:r>
-      <w:proofErr w:type="gramEnd"/>
-      <w:r>
-        <w:t xml:space="preserve"> Garda Síochána (2016) </w:t>
+      <w:r>
+        <w:t xml:space="preserve">An Garda Síochána (2016) </w:t>
       </w:r>
       <w:r>
         <w:rPr>
@@ -47934,24 +47846,34 @@
       <w:r>
         <w:t xml:space="preserve">, </w:t>
       </w:r>
-      <w:proofErr w:type="gramStart"/>
       <w:r>
         <w:rPr>
           <w:i/>
           <w:iCs/>
         </w:rPr>
-        <w:t>An</w:t>
-      </w:r>
-      <w:proofErr w:type="gramEnd"/>
+        <w:t>An Garda Síochána</w:t>
+      </w:r>
+      <w:r>
+        <w:t>. Available at: https://www.garda.ie/en/about-us/organised-serious-crime/garda-national-vetting-bureau-gnvb-/ (Accessed: 7 March 2026).</w:t>
+      </w:r>
+    </w:p>
+    <w:p>
+      <w:pPr>
+        <w:pStyle w:val="Bibliography"/>
+        <w:jc w:val="left"/>
+      </w:pPr>
+      <w:r>
+        <w:t xml:space="preserve">Athletics Ireland (2026) ‘Athletics Ireland - Garda Vetting Policy’, </w:t>
+      </w:r>
       <w:r>
         <w:rPr>
           <w:i/>
           <w:iCs/>
         </w:rPr>
-        <w:t xml:space="preserve"> Garda Síochána</w:t>
-      </w:r>
-      <w:r>
-        <w:t>. Available at: https://www.garda.ie/en/about-us/organised-serious-crime/garda-national-vetting-bureau-gnvb-/ (Accessed: 7 March 2026).</w:t>
+        <w:t>Athletics Ireland</w:t>
+      </w:r>
+      <w:r>
+        <w:t>. Available at: https://www.athleticsireland.ie/child-welfare/garda-vetting-policy/ (Accessed: 7 March 2026).</w:t>
       </w:r>
     </w:p>
     <w:p>
@@ -47960,17 +47882,27 @@
         <w:jc w:val="left"/>
       </w:pPr>
       <w:r>
-        <w:t xml:space="preserve">Athletics Ireland (2026) ‘Athletics Ireland - Garda Vetting Policy’, </w:t>
+        <w:t xml:space="preserve">Cairn Community Games (2025) </w:t>
       </w:r>
       <w:r>
         <w:rPr>
           <w:i/>
           <w:iCs/>
         </w:rPr>
-        <w:t>Athletics Ireland</w:t>
-      </w:r>
-      <w:r>
-        <w:t>. Available at: https://www.athleticsireland.ie/child-welfare/garda-vetting-policy/ (Accessed: 7 March 2026).</w:t>
+        <w:t>Cairn Community Games</w:t>
+      </w:r>
+      <w:r>
+        <w:t xml:space="preserve">, </w:t>
+      </w:r>
+      <w:r>
+        <w:rPr>
+          <w:i/>
+          <w:iCs/>
+        </w:rPr>
+        <w:t>Garda Vetting Process</w:t>
+      </w:r>
+      <w:r>
+        <w:t>. Available at: https://www.cairncommunitygames.ie/volunteers/vetting (Accessed: 7 March 2026).</w:t>
       </w:r>
     </w:p>
     <w:p>
@@ -47979,27 +47911,36 @@
         <w:jc w:val="left"/>
       </w:pPr>
       <w:r>
-        <w:t xml:space="preserve">Cairn Community Games (2025) </w:t>
+        <w:t xml:space="preserve">Central Statistics Office (2024) </w:t>
       </w:r>
       <w:r>
         <w:rPr>
           <w:i/>
           <w:iCs/>
         </w:rPr>
-        <w:t>Cairn Community Games</w:t>
-      </w:r>
-      <w:r>
-        <w:t xml:space="preserve">, </w:t>
+        <w:t>Key Findings Census of Population 2022 Spotlight Series: Volunteering in Ireland</w:t>
+      </w:r>
+      <w:r>
+        <w:t>. CSO. Available at: https://www.cso.ie/en/releasesandpublications/ep/p-cpsv/censusofpopulation2022spotlightseriesvolunteeringinireland/keyfindings/ (Accessed: 6 March 2026).</w:t>
+      </w:r>
+    </w:p>
+    <w:p>
+      <w:pPr>
+        <w:pStyle w:val="Bibliography"/>
+        <w:jc w:val="left"/>
+      </w:pPr>
+      <w:r>
+        <w:t xml:space="preserve">Data Protection Commission (2021) </w:t>
       </w:r>
       <w:r>
         <w:rPr>
           <w:i/>
           <w:iCs/>
         </w:rPr>
-        <w:t>Garda Vetting Process</w:t>
-      </w:r>
-      <w:r>
-        <w:t>. Available at: https://www.cairncommunitygames.ie/volunteers/vetting (Accessed: 7 March 2026).</w:t>
+        <w:t>Garda Vetting – Some Data Protection Considerations</w:t>
+      </w:r>
+      <w:r>
+        <w:t>. Available at: https://www.dataprotection.ie/sites/default/files/uploads/2021-05/Garda%20Vetting%20April%202021..pdf (Accessed: 14 March 2026).</w:t>
       </w:r>
     </w:p>
     <w:p>
@@ -48008,17 +47949,17 @@
         <w:jc w:val="left"/>
       </w:pPr>
       <w:r>
-        <w:t xml:space="preserve">Central Statistics Office (2024) </w:t>
+        <w:t xml:space="preserve">Data Protection Commission (no date) </w:t>
       </w:r>
       <w:r>
         <w:rPr>
           <w:i/>
           <w:iCs/>
         </w:rPr>
-        <w:t>Key Findings Census of Population 2022 Spotlight Series: Volunteering in Ireland</w:t>
-      </w:r>
-      <w:r>
-        <w:t>. CSO. Available at: https://www.cso.ie/en/releasesandpublications/ep/p-cpsv/censusofpopulation2022spotlightseriesvolunteeringinireland/keyfindings/ (Accessed: 6 March 2026).</w:t>
+        <w:t>Your Rights under the GDPR</w:t>
+      </w:r>
+      <w:r>
+        <w:t>. Available at: https://www.dataprotection.ie/individuals/rights-individuals-under-general-data-protection-regulation (Accessed: 11 April 2026).</w:t>
       </w:r>
     </w:p>
     <w:p>
@@ -48027,25 +47968,27 @@
         <w:jc w:val="left"/>
       </w:pPr>
       <w:r>
-        <w:t xml:space="preserve">Data Protection Commission (2021) </w:t>
+        <w:t xml:space="preserve">Department of Justice, Home Affairs and Migration (2021) </w:t>
       </w:r>
       <w:r>
         <w:rPr>
           <w:i/>
           <w:iCs/>
         </w:rPr>
-        <w:t>Garda Vetting – Some Data Protection Considerations</w:t>
-      </w:r>
-      <w:r>
-        <w:t xml:space="preserve">. Available at: </w:t>
-      </w:r>
-      <w:proofErr w:type="gramStart"/>
-      <w:r>
-        <w:t>https://www.dataprotection.ie/sites/default/files/uploads/2021-05/Garda%20Vetting%20April%202021..</w:t>
-      </w:r>
-      <w:proofErr w:type="gramEnd"/>
-      <w:r>
-        <w:t>pdf (Accessed: 14 March 2026).</w:t>
+        <w:t>Minister McEntee moves to reform vetting arrangements and legislation</w:t>
+      </w:r>
+      <w:r>
+        <w:t xml:space="preserve">, </w:t>
+      </w:r>
+      <w:r>
+        <w:rPr>
+          <w:i/>
+          <w:iCs/>
+        </w:rPr>
+        <w:t>gov.ie</w:t>
+      </w:r>
+      <w:r>
+        <w:t>. Available at: https://www.gov.ie/en/department-of-justice-home-affairs-and-migration/press-releases/minister-mcentee-moves-to-reform-vetting-arrangements-and-legislation/ (Accessed: 14 March 2026).</w:t>
       </w:r>
     </w:p>
     <w:p>
@@ -48054,17 +47997,27 @@
         <w:jc w:val="left"/>
       </w:pPr>
       <w:r>
-        <w:t xml:space="preserve">Data Protection Commission (no date) </w:t>
+        <w:t xml:space="preserve">Department of Rural and Community Development (2021) </w:t>
       </w:r>
       <w:r>
         <w:rPr>
           <w:i/>
           <w:iCs/>
         </w:rPr>
-        <w:t>Your Rights under the GDPR</w:t>
-      </w:r>
-      <w:r>
-        <w:t>. Available at: https://www.dataprotection.ie/individuals/rights-individuals-under-general-data-protection-regulation (Accessed: 11 April 2026).</w:t>
+        <w:t>National Volunteering Strategy (2021 - 2025)</w:t>
+      </w:r>
+      <w:r>
+        <w:t xml:space="preserve">, </w:t>
+      </w:r>
+      <w:r>
+        <w:rPr>
+          <w:i/>
+          <w:iCs/>
+        </w:rPr>
+        <w:t>gov.ie</w:t>
+      </w:r>
+      <w:r>
+        <w:t>. Available at: https://www.gov.ie/en/department-of-rural-and-community-development-and-the-gaeltacht/publications/national-volunteering-strategy-2021-2025/ (Accessed: 9 March 2026).</w:t>
       </w:r>
     </w:p>
     <w:p>
@@ -48073,14 +48026,14 @@
         <w:jc w:val="left"/>
       </w:pPr>
       <w:r>
-        <w:t xml:space="preserve">Department of Justice, Home Affairs and Migration (2021) </w:t>
+        <w:t xml:space="preserve">Driessen, V. (2010) </w:t>
       </w:r>
       <w:r>
         <w:rPr>
           <w:i/>
           <w:iCs/>
         </w:rPr>
-        <w:t>Minister McEntee moves to reform vetting arrangements and legislation</w:t>
+        <w:t>A successful Git branching model</w:t>
       </w:r>
       <w:r>
         <w:t xml:space="preserve">, </w:t>
@@ -48090,10 +48043,10 @@
           <w:i/>
           <w:iCs/>
         </w:rPr>
-        <w:t>gov.ie</w:t>
-      </w:r>
-      <w:r>
-        <w:t>. Available at: https://www.gov.ie/en/department-of-justice-home-affairs-and-migration/press-releases/minister-mcentee-moves-to-reform-vetting-arrangements-and-legislation/ (Accessed: 14 March 2026).</w:t>
+        <w:t>nvie.com</w:t>
+      </w:r>
+      <w:r>
+        <w:t>. Available at: https://nvie.com/posts/a-successful-git-branching-model/ (Accessed: 22 March 2026).</w:t>
       </w:r>
     </w:p>
     <w:p>
@@ -48102,14 +48055,14 @@
         <w:jc w:val="left"/>
       </w:pPr>
       <w:r>
-        <w:t xml:space="preserve">Department of Rural and Community Development (2021) </w:t>
+        <w:t xml:space="preserve">Fowler, M. (2024) </w:t>
       </w:r>
       <w:r>
         <w:rPr>
           <w:i/>
           <w:iCs/>
         </w:rPr>
-        <w:t>National Volunteering Strategy (2021 - 2025)</w:t>
+        <w:t>Continuous Integration</w:t>
       </w:r>
       <w:r>
         <w:t xml:space="preserve">, </w:t>
@@ -48119,10 +48072,10 @@
           <w:i/>
           <w:iCs/>
         </w:rPr>
-        <w:t>gov.ie</w:t>
-      </w:r>
-      <w:r>
-        <w:t>. Available at: https://www.gov.ie/en/department-of-rural-and-community-development-and-the-gaeltacht/publications/national-volunteering-strategy-2021-2025/ (Accessed: 9 March 2026).</w:t>
+        <w:t>martinfowler.com</w:t>
+      </w:r>
+      <w:r>
+        <w:t>. Available at: https://martinfowler.com/articles/continuousIntegration.html (Accessed: 30 March 2026).</w:t>
       </w:r>
     </w:p>
     <w:p>
@@ -48131,27 +48084,50 @@
         <w:jc w:val="left"/>
       </w:pPr>
       <w:r>
-        <w:t xml:space="preserve">Driessen, V. (2010) </w:t>
+        <w:t xml:space="preserve">Freeman, A. (2023) </w:t>
       </w:r>
       <w:r>
         <w:rPr>
           <w:i/>
           <w:iCs/>
         </w:rPr>
-        <w:t>A successful Git branching model</w:t>
-      </w:r>
-      <w:r>
-        <w:t xml:space="preserve">, </w:t>
+        <w:t>Pro ASP.NET Core 7</w:t>
+      </w:r>
+      <w:r>
+        <w:t>. Tenth edition. Shelter Island, NY: Manning Publications.</w:t>
+      </w:r>
+    </w:p>
+    <w:p>
+      <w:pPr>
+        <w:pStyle w:val="Bibliography"/>
+        <w:jc w:val="left"/>
+      </w:pPr>
+      <w:r>
+        <w:t xml:space="preserve">Government of Ireland (2012) </w:t>
       </w:r>
       <w:r>
         <w:rPr>
           <w:i/>
           <w:iCs/>
         </w:rPr>
-        <w:t>nvie.com</w:t>
-      </w:r>
-      <w:r>
-        <w:t>. Available at: https://nvie.com/posts/a-successful-git-branching-model/ (Accessed: 22 March 2026).</w:t>
+        <w:t>Electronic Irish Statute Book (eISB)</w:t>
+      </w:r>
+      <w:r>
+        <w:t xml:space="preserve">, </w:t>
+      </w:r>
+      <w:r>
+        <w:rPr>
+          <w:i/>
+          <w:iCs/>
+        </w:rPr>
+        <w:t>National Vetting Bureau (Children and Vulnerable Persons) Act 2012</w:t>
+      </w:r>
+      <w:r>
+        <w:t xml:space="preserve">. Office of the Attorney General. Available at: </w:t>
+      </w:r>
+      <w:r>
+        <w:lastRenderedPageBreak/>
+        <w:t>https://www.irishstatutebook.ie/eli/2012/act/47/enacted/en/html (Accessed: 6 March 2026).</w:t>
       </w:r>
     </w:p>
     <w:p>
@@ -48160,14 +48136,14 @@
         <w:jc w:val="left"/>
       </w:pPr>
       <w:r>
-        <w:t xml:space="preserve">Fowler, M. (2024) </w:t>
+        <w:t xml:space="preserve">Microsoft (2026a) </w:t>
       </w:r>
       <w:r>
         <w:rPr>
           <w:i/>
           <w:iCs/>
         </w:rPr>
-        <w:t>Continuous Integration</w:t>
+        <w:t>RandomNumberGenerator Class (System.Security.Cryptography)</w:t>
       </w:r>
       <w:r>
         <w:t xml:space="preserve">, </w:t>
@@ -48177,10 +48153,10 @@
           <w:i/>
           <w:iCs/>
         </w:rPr>
-        <w:t>martinfowler.com</w:t>
-      </w:r>
-      <w:r>
-        <w:t>. Available at: https://martinfowler.com/articles/continuousIntegration.html (Accessed: 30 March 2026).</w:t>
+        <w:t>RandomNumberGenerator Class</w:t>
+      </w:r>
+      <w:r>
+        <w:t>. Available at: https://learn.microsoft.com/en-us/dotnet/api/system.security.cryptography.randomnumbergenerator?view=net-10.0 (Accessed: 25 April 2026).</w:t>
       </w:r>
     </w:p>
     <w:p>
@@ -48189,17 +48165,17 @@
         <w:jc w:val="left"/>
       </w:pPr>
       <w:r>
-        <w:t xml:space="preserve">Freeman, A. (2023) </w:t>
+        <w:t xml:space="preserve">Microsoft (2026b) </w:t>
       </w:r>
       <w:r>
         <w:rPr>
           <w:i/>
           <w:iCs/>
         </w:rPr>
-        <w:t>Pro ASP.NET Core 7</w:t>
-      </w:r>
-      <w:r>
-        <w:t>. Tenth edition. Shelter Island, NY: Manning Publications.</w:t>
+        <w:t>SQL Server Express LocalDB - SQL Server</w:t>
+      </w:r>
+      <w:r>
+        <w:t>. Available at: https://learn.microsoft.com/en-us/sql/database-engine/configure-windows/sql-server-express-localdb?view=sql-server-ver17 (Accessed: 21 April 2026).</w:t>
       </w:r>
     </w:p>
     <w:p>
@@ -48208,47 +48184,65 @@
         <w:jc w:val="left"/>
       </w:pPr>
       <w:r>
-        <w:t xml:space="preserve">Government of Ireland (2012) </w:t>
+        <w:t xml:space="preserve">Microsoft (no date) </w:t>
       </w:r>
       <w:r>
         <w:rPr>
           <w:i/>
           <w:iCs/>
         </w:rPr>
-        <w:t>Electronic Irish Statute Book (</w:t>
-      </w:r>
-      <w:proofErr w:type="spellStart"/>
+        <w:t>DateTimeOffset Struct (System) — .NET 10</w:t>
+      </w:r>
+      <w:r>
+        <w:t>. Available at: https://learn.microsoft.com/en-us/dotnet/api/system.datetimeoffset?view=net-10.0 (Accessed: 11 April 2026).</w:t>
+      </w:r>
+    </w:p>
+    <w:p>
+      <w:pPr>
+        <w:pStyle w:val="Bibliography"/>
+        <w:jc w:val="left"/>
+      </w:pPr>
+      <w:r>
+        <w:t xml:space="preserve">National Vetting Bureau (no date) </w:t>
+      </w:r>
       <w:r>
         <w:rPr>
           <w:i/>
           <w:iCs/>
         </w:rPr>
-        <w:t>eISB</w:t>
-      </w:r>
-      <w:proofErr w:type="spellEnd"/>
+        <w:t>National Vetting Bureau - About eVetting</w:t>
+      </w:r>
+      <w:r>
+        <w:t xml:space="preserve">, </w:t>
+      </w:r>
       <w:r>
         <w:rPr>
           <w:i/>
           <w:iCs/>
         </w:rPr>
-        <w:t>)</w:t>
-      </w:r>
-      <w:r>
-        <w:t xml:space="preserve">, </w:t>
+        <w:t>An Garda Síochána</w:t>
+      </w:r>
+      <w:r>
+        <w:t>. Available at: https://vetting.garda.ie/Application/About (Accessed: 7 March 2026).</w:t>
+      </w:r>
+    </w:p>
+    <w:p>
+      <w:pPr>
+        <w:pStyle w:val="Bibliography"/>
+        <w:jc w:val="left"/>
+      </w:pPr>
+      <w:r>
+        <w:t xml:space="preserve">Sommerville, I. (2016) </w:t>
       </w:r>
       <w:r>
         <w:rPr>
           <w:i/>
           <w:iCs/>
         </w:rPr>
-        <w:t>National Vetting Bureau (Children and Vulnerable Persons) Act 2012</w:t>
-      </w:r>
-      <w:r>
-        <w:t xml:space="preserve">. Office of the Attorney General. Available at: </w:t>
-      </w:r>
-      <w:r>
-        <w:lastRenderedPageBreak/>
-        <w:t>https://www.irishstatutebook.ie/eli/2012/act/47/enacted/en/html (Accessed: 6 March 2026).</w:t>
+        <w:t>Software engineering</w:t>
+      </w:r>
+      <w:r>
+        <w:t>. Tenth edition. Boston: Pearson.</w:t>
       </w:r>
     </w:p>
     <w:p>
@@ -48257,241 +48251,33 @@
         <w:jc w:val="left"/>
       </w:pPr>
       <w:r>
-        <w:t xml:space="preserve">Microsoft (2026a) </w:t>
-      </w:r>
-      <w:proofErr w:type="spellStart"/>
+        <w:t xml:space="preserve">Wysocki, R.K. (2019) </w:t>
+      </w:r>
       <w:r>
         <w:rPr>
           <w:i/>
           <w:iCs/>
         </w:rPr>
-        <w:t>RandomNumberGenerator</w:t>
-      </w:r>
-      <w:proofErr w:type="spellEnd"/>
+        <w:t>Effective project management: traditional, agile, extreme, hybrid</w:t>
+      </w:r>
+      <w:r>
+        <w:t>. Eighth edition. Indianapolis, IN: Wiley.</w:t>
+      </w:r>
+    </w:p>
+    <w:p>
+      <w:pPr>
+        <w:pStyle w:val="Bibliography"/>
+        <w:jc w:val="left"/>
+      </w:pPr>
+      <w:r>
+        <w:t xml:space="preserve">Ziąbek, M. (2026) </w:t>
+      </w:r>
       <w:r>
         <w:rPr>
           <w:i/>
           <w:iCs/>
         </w:rPr>
-        <w:t xml:space="preserve"> Class (</w:t>
-      </w:r>
-      <w:proofErr w:type="spellStart"/>
-      <w:proofErr w:type="gramStart"/>
-      <w:r>
-        <w:rPr>
-          <w:i/>
-          <w:iCs/>
-        </w:rPr>
-        <w:t>System.Security.Cryptography</w:t>
-      </w:r>
-      <w:proofErr w:type="spellEnd"/>
-      <w:proofErr w:type="gramEnd"/>
-      <w:r>
-        <w:rPr>
-          <w:i/>
-          <w:iCs/>
-        </w:rPr>
-        <w:t>)</w:t>
-      </w:r>
-      <w:r>
-        <w:t xml:space="preserve">, </w:t>
-      </w:r>
-      <w:proofErr w:type="spellStart"/>
-      <w:r>
-        <w:rPr>
-          <w:i/>
-          <w:iCs/>
-        </w:rPr>
-        <w:t>RandomNumberGenerator</w:t>
-      </w:r>
-      <w:proofErr w:type="spellEnd"/>
-      <w:r>
-        <w:rPr>
-          <w:i/>
-          <w:iCs/>
-        </w:rPr>
-        <w:t xml:space="preserve"> Class</w:t>
-      </w:r>
-      <w:r>
-        <w:t>. Available at: https://learn.microsoft.com/en-us/dotnet/api/system.security.cryptography.randomnumbergenerator?view=net-10.0 (Accessed: 25 April 2026).</w:t>
-      </w:r>
-    </w:p>
-    <w:p>
-      <w:pPr>
-        <w:pStyle w:val="Bibliography"/>
-        <w:jc w:val="left"/>
-      </w:pPr>
-      <w:r>
-        <w:t xml:space="preserve">Microsoft (2026b) </w:t>
-      </w:r>
-      <w:r>
-        <w:rPr>
-          <w:i/>
-          <w:iCs/>
-        </w:rPr>
-        <w:t xml:space="preserve">SQL Server Express </w:t>
-      </w:r>
-      <w:proofErr w:type="spellStart"/>
-      <w:r>
-        <w:rPr>
-          <w:i/>
-          <w:iCs/>
-        </w:rPr>
-        <w:t>LocalDB</w:t>
-      </w:r>
-      <w:proofErr w:type="spellEnd"/>
-      <w:r>
-        <w:rPr>
-          <w:i/>
-          <w:iCs/>
-        </w:rPr>
-        <w:t xml:space="preserve"> - SQL Server</w:t>
-      </w:r>
-      <w:r>
-        <w:t>. Available at: https://learn.microsoft.com/en-us/sql/database-engine/configure-windows/sql-server-express-localdb?view=sql-server-ver17 (Accessed: 21 April 2026).</w:t>
-      </w:r>
-    </w:p>
-    <w:p>
-      <w:pPr>
-        <w:pStyle w:val="Bibliography"/>
-        <w:jc w:val="left"/>
-      </w:pPr>
-      <w:r>
-        <w:t xml:space="preserve">Microsoft (no date) </w:t>
-      </w:r>
-      <w:proofErr w:type="spellStart"/>
-      <w:r>
-        <w:rPr>
-          <w:i/>
-          <w:iCs/>
-        </w:rPr>
-        <w:t>DateTimeOffset</w:t>
-      </w:r>
-      <w:proofErr w:type="spellEnd"/>
-      <w:r>
-        <w:rPr>
-          <w:i/>
-          <w:iCs/>
-        </w:rPr>
-        <w:t xml:space="preserve"> Struct (System) — .NET 10</w:t>
-      </w:r>
-      <w:r>
-        <w:t>. Available at: https://learn.microsoft.com/en-us/dotnet/api/system.datetimeoffset?view=net-10.0 (Accessed: 11 April 2026).</w:t>
-      </w:r>
-    </w:p>
-    <w:p>
-      <w:pPr>
-        <w:pStyle w:val="Bibliography"/>
-        <w:jc w:val="left"/>
-      </w:pPr>
-      <w:r>
-        <w:t xml:space="preserve">National Vetting Bureau (no date) </w:t>
-      </w:r>
-      <w:r>
-        <w:rPr>
-          <w:i/>
-          <w:iCs/>
-        </w:rPr>
-        <w:t xml:space="preserve">National Vetting Bureau - About </w:t>
-      </w:r>
-      <w:proofErr w:type="spellStart"/>
-      <w:r>
-        <w:rPr>
-          <w:i/>
-          <w:iCs/>
-        </w:rPr>
-        <w:t>eVetting</w:t>
-      </w:r>
-      <w:proofErr w:type="spellEnd"/>
-      <w:r>
-        <w:t xml:space="preserve">, </w:t>
-      </w:r>
-      <w:proofErr w:type="gramStart"/>
-      <w:r>
-        <w:rPr>
-          <w:i/>
-          <w:iCs/>
-        </w:rPr>
-        <w:t>An</w:t>
-      </w:r>
-      <w:proofErr w:type="gramEnd"/>
-      <w:r>
-        <w:rPr>
-          <w:i/>
-          <w:iCs/>
-        </w:rPr>
-        <w:t xml:space="preserve"> Garda Síochána</w:t>
-      </w:r>
-      <w:r>
-        <w:t>. Available at: https://vetting.garda.ie/Application/About (Accessed: 7 March 2026).</w:t>
-      </w:r>
-    </w:p>
-    <w:p>
-      <w:pPr>
-        <w:pStyle w:val="Bibliography"/>
-        <w:jc w:val="left"/>
-      </w:pPr>
-      <w:r>
-        <w:t xml:space="preserve">Sommerville, I. (2016) </w:t>
-      </w:r>
-      <w:r>
-        <w:rPr>
-          <w:i/>
-          <w:iCs/>
-        </w:rPr>
-        <w:t>Software engineering</w:t>
-      </w:r>
-      <w:r>
-        <w:t>. Tenth edition. Boston: Pearson.</w:t>
-      </w:r>
-    </w:p>
-    <w:p>
-      <w:pPr>
-        <w:pStyle w:val="Bibliography"/>
-        <w:jc w:val="left"/>
-      </w:pPr>
-      <w:r>
-        <w:t xml:space="preserve">Wysocki, R.K. (2019) </w:t>
-      </w:r>
-      <w:r>
-        <w:rPr>
-          <w:i/>
-          <w:iCs/>
-        </w:rPr>
-        <w:t>Effective project management: traditional, agile, extreme, hybrid</w:t>
-      </w:r>
-      <w:r>
-        <w:t>. Eighth edition. Indianapolis, IN: Wiley.</w:t>
-      </w:r>
-    </w:p>
-    <w:p>
-      <w:pPr>
-        <w:pStyle w:val="Bibliography"/>
-        <w:jc w:val="left"/>
-      </w:pPr>
-      <w:proofErr w:type="spellStart"/>
-      <w:r>
-        <w:t>Ziąbek</w:t>
-      </w:r>
-      <w:proofErr w:type="spellEnd"/>
-      <w:r>
-        <w:t xml:space="preserve">, M. (2026) </w:t>
-      </w:r>
-      <w:proofErr w:type="spellStart"/>
-      <w:r>
-        <w:rPr>
-          <w:i/>
-          <w:iCs/>
-        </w:rPr>
-        <w:t>QuestPDF</w:t>
-      </w:r>
-      <w:proofErr w:type="spellEnd"/>
-      <w:r>
-        <w:rPr>
-          <w:i/>
-          <w:iCs/>
-        </w:rPr>
-        <w:t xml:space="preserve"> | C# PDF Generation Library</w:t>
+        <w:t>QuestPDF | C# PDF Generation Library</w:t>
       </w:r>
       <w:r>
         <w:t>. Available at: https://www.questpdf.com/ (Accessed: 25 April 2026).</w:t>
@@ -54197,6 +53983,7 @@
   <w:style w:type="character" w:default="1" w:styleId="DefaultParagraphFont">
     <w:name w:val="Default Paragraph Font"/>
     <w:uiPriority w:val="1"/>
+    <w:semiHidden/>
     <w:unhideWhenUsed/>
   </w:style>
   <w:style w:type="table" w:default="1" w:styleId="TableNormal">
@@ -54320,10 +54107,14 @@
     <w:uiPriority w:val="39"/>
     <w:unhideWhenUsed/>
     <w:qFormat/>
-    <w:rsid w:val="00B423A0"/>
+    <w:rsid w:val="000C45F9"/>
     <w:pPr>
+      <w:tabs>
+        <w:tab w:val="left" w:pos="960"/>
+        <w:tab w:val="right" w:leader="dot" w:pos="9016"/>
+      </w:tabs>
       <w:spacing w:after="100"/>
-      <w:ind w:left="220"/>
+      <w:ind w:left="221"/>
     </w:pPr>
   </w:style>
   <w:style w:type="table" w:styleId="TableGrid">

</xml_diff>